<commit_message>
docs: update LKS proposal and test project word generator
</commit_message>
<xml_diff>
--- a/docs/Test_Project_AI_Genesis.docx
+++ b/docs/Test_Project_AI_Genesis.docx
@@ -30,9 +30,9 @@
           <w:rFonts w:ascii="Arial" w:hAnsi="Arial"/>
           <w:b/>
           <w:color w:val="0A2240"/>
-          <w:sz w:val="44"/>
+          <w:sz w:val="40"/>
         </w:rPr>
-        <w:t>TEST PROJECT PROPOSAL</w:t>
+        <w:t>PROPOSAL PROYEK UJI (TEST PROJECT PROPOSAL)</w:t>
         <w:br/>
         <w:t>Kecerdasan Artifisial (Artificial Intelligence)</w:t>
         <w:br/>
@@ -49,7 +49,7 @@
           <w:color w:val="555555"/>
           <w:sz w:val="22"/>
         </w:rPr>
-        <w:t>Nama Proyek Uji: Genesis — Platform Pelaporan Lingkungan Cerdas Berbasis Crowdsourcing, Deteksi Spasial Anti-Spam, Sensor Gambar Privasi (PII), dan Asisten Regulasi Hukum RAG dengan Model Routing</w:t>
+        <w:t>Nama Proyek: Genesis — Platform Pelaporan Ekologi Berbasis Crowdsourcing dengan Anti-Spam Spasial, Sensor Data Sensitif (PII Redaction), dan Chatbot RAG Hukum Berbasis Model Routing Hybrid</w:t>
         <w:br/>
       </w:r>
     </w:p>
@@ -71,7 +71,7 @@
           <w:color w:val="0A2240"/>
           <w:sz w:val="28"/>
         </w:rPr>
-        <w:t>Contents</w:t>
+        <w:t>Daftar Isi</w:t>
       </w:r>
     </w:p>
     <w:p>
@@ -87,7 +87,7 @@
           <w:color w:val="000000"/>
           <w:sz w:val="21"/>
         </w:rPr>
-        <w:t>Dokumen Test Project Proposal ini terbagi atas beberapa bagian wajib sesuai ketentuan WorldSkills International:</w:t>
+        <w:t>Proposal proyek uji ini terbagi atas beberapa bagian wajib sesuai ketentuan WorldSkills International:</w:t>
         <w:br/>
       </w:r>
       <w:r>
@@ -98,7 +98,7 @@
           <w:color w:val="000000"/>
           <w:sz w:val="21"/>
         </w:rPr>
-        <w:t>1. Introduction</w:t>
+        <w:t>1. Pendahuluan</w:t>
         <w:br/>
       </w:r>
       <w:r>
@@ -109,7 +109,7 @@
           <w:color w:val="000000"/>
           <w:sz w:val="21"/>
         </w:rPr>
-        <w:t xml:space="preserve">   - Memuat latar belakang masalah ekologi, visi solusi platform Genesis, dan bagan perutean model kecerdasan artifisial.</w:t>
+        <w:t xml:space="preserve">   - Memuat latar belakang masalah ekologi, solusi konsep Genesis, dan bagan alur arsitektur teknis.</w:t>
         <w:br/>
       </w:r>
       <w:r>
@@ -120,7 +120,7 @@
           <w:color w:val="000000"/>
           <w:sz w:val="21"/>
         </w:rPr>
-        <w:t>2. Description of project and tasks</w:t>
+        <w:t>2. Deskripsi Proyek dan Tugas</w:t>
         <w:br/>
       </w:r>
       <w:r>
@@ -131,7 +131,7 @@
           <w:color w:val="000000"/>
           <w:sz w:val="21"/>
         </w:rPr>
-        <w:t xml:space="preserve">   - Memuat pembagian modul kerja kompetitor (Modul A hingga Modul D) beserta deliverables teknis yang diharapkan.</w:t>
+        <w:t xml:space="preserve">   - Menjelaskan pembagian modul evaluasi (Modul A hingga Modul D) serta target hasil pembelajaran.</w:t>
         <w:br/>
       </w:r>
       <w:r>
@@ -142,7 +142,7 @@
           <w:color w:val="000000"/>
           <w:sz w:val="21"/>
         </w:rPr>
-        <w:t>3. Instructions to the Competitor</w:t>
+        <w:t>3. Instruksi kepada Peserta</w:t>
         <w:br/>
       </w:r>
       <w:r>
@@ -153,7 +153,7 @@
           <w:color w:val="000000"/>
           <w:sz w:val="21"/>
         </w:rPr>
-        <w:t xml:space="preserve">   - Panduan implementasi teknis langkah demi langkah, struktur repositori, spesifikasi basis data, dan batasan operasional.</w:t>
+        <w:t xml:space="preserve">   - Menyajikan spesifikasi teknis, hasil yang diharapkan, serta batasan untuk setiap modul kompetensi uji.</w:t>
         <w:br/>
       </w:r>
       <w:r>
@@ -164,7 +164,7 @@
           <w:color w:val="000000"/>
           <w:sz w:val="21"/>
         </w:rPr>
-        <w:t>4. Other</w:t>
+        <w:t>4. Lain-lain</w:t>
         <w:br/>
       </w:r>
       <w:r>
@@ -175,7 +175,7 @@
           <w:color w:val="000000"/>
           <w:sz w:val="21"/>
         </w:rPr>
-        <w:t xml:space="preserve">   - Menjabarkan kerangka kerja Responsible AI, manajemen mitigasi risiko, batasan data privasi, dan matriks penilaian LKS Nasional.</w:t>
+        <w:t xml:space="preserve">   - Menjelaskan kerangka kerja Responsible AI, batasan data privasi, dan matriks penilaian LKS Nasional.</w:t>
       </w:r>
     </w:p>
     <w:p>
@@ -191,7 +191,7 @@
           <w:color w:val="0A2240"/>
           <w:sz w:val="28"/>
         </w:rPr>
-        <w:t>Introduction</w:t>
+        <w:t>Pendahuluan</w:t>
       </w:r>
     </w:p>
     <w:p>
@@ -207,273 +207,68 @@
           <w:color w:val="000000"/>
           <w:sz w:val="21"/>
         </w:rPr>
-        <w:t>Kerusakan akibat perubahan iklim yang kompleks di Indonesia memerlukan sistem pengambilan keputusan adaptif berbasis bukti. Banyak platform pelaporan lingkungan konvensional saat ini mengalami kegagalan adopsi karena tidak menyediakan insentif nyata bagi warga serta menyimpan laporan sebagai entitas terisolasi yang tidak saling terhubung. Informasi yang masuk terbiarkan menumpuk tanpa menjadi landasan pembentukan pengetahuan baru. Akibatnya, setiap permasalahan diperlakukan sebagai kasus terpisah tanpa akumulasi pembelajaran.</w:t>
+        <w:t>Kompleksitas kerusakan akibat perubahan iklim di Indonesia memerlukan sistem pengambilan keputusan yang adaptif dan berbasis bukti. Platform pelaporan lingkungan konvensional saat ini sering kali mengalami kegagalan adopsi karena ketiadaan insentif partisipasi bagi warga, serta menyimpan data laporan sebagai entitas terisolasi yang berdiri sendiri. Ketiadaan integrasi data ini menghambat akumulasi wawasan ekologi lokal, sehingga memicu laporan ganda yang berulang dan membebani kinerja petugas administratif Dinas Lingkungan Hidup.</w:t>
         <w:br/>
         <w:br/>
-        <w:t xml:space="preserve">Genesis hadir sebagai platform aksi iklim lokal berbasis crowdsourcing untuk menjawab tantangan tersebut dengan mengintegrasikan aplikasi mobile warga (Flutter BLoC), dasbor admin (Next.js), dan server backend (NestJS Fastify) pada infrastruktur Google Cloud Platform (GCP). Sistem ini menerapkan validasi otomatis anti-spam geospasial, penyaringan data sensitif (PII redaction) otomatis, serta asisten hukum regulasi lingkungan hidup berbasis Retrieval-Augmented Generation (RAG). Selama proses pengembangan, tim memanfaatkan </w:t>
-      </w:r>
-      <w:r>
-        <w:rPr>
-          <w:rFonts w:ascii="Arial" w:hAnsi="Arial"/>
-          <w:b/>
-          <w:i w:val="0"/>
-          <w:color w:val="000000"/>
-          <w:sz w:val="21"/>
-        </w:rPr>
-        <w:t>Google Antigravity sebagai AI coding assistant</w:t>
-      </w:r>
-      <w:r>
-        <w:rPr>
-          <w:rFonts w:ascii="Arial" w:hAnsi="Arial"/>
-          <w:b w:val="0"/>
-          <w:i w:val="0"/>
-          <w:color w:val="000000"/>
-          <w:sz w:val="21"/>
-        </w:rPr>
-        <w:t xml:space="preserve"> untuk penyusunan dokumentasi teknis dan optimasi kode, sementara perancangan arsitektur, implementasi fitur, validasi, dan pengujian sistem dilakukan secara mandiri oleh tim.</w:t>
+        <w:t>Genesis dirancang sebagai platform aksi iklim lokal berbasis crowdsourcing untuk menjembatani celah tersebut. Sistem ini mengintegrasikan aplikasi mobile warga untuk pelaporan, dasbor admin web untuk kurasi data, serta server backend yang menerapkan ekstensi basis data spasial dan mesin AI pada Google Cloud Platform (GCP). Selama proses pengembangan, tim memanfaatkan Google Antigravity sebagai AI coding assistant untuk penyusunan dokumentasi teknis dan optimasi kode, sedangkan seluruh logika sistem, validasi pengujian, dan desain arsitektur diselesaikan secara mandiri oleh tim.</w:t>
         <w:br/>
         <w:br/>
-        <w:t xml:space="preserve">Untuk mengoptimalkan efisiensi biaya operasional dan kecepatan respons sistem (latensi), backend Genesis menerapkan pola </w:t>
-      </w:r>
-      <w:r>
-        <w:rPr>
-          <w:rFonts w:ascii="Arial" w:hAnsi="Arial"/>
-          <w:b/>
-          <w:i w:val="0"/>
-          <w:color w:val="000000"/>
-          <w:sz w:val="21"/>
-        </w:rPr>
-        <w:t>Dynamic Model Routing (Perutean Model Dinamis)</w:t>
-      </w:r>
-      <w:r>
-        <w:rPr>
-          <w:rFonts w:ascii="Arial" w:hAnsi="Arial"/>
-          <w:b w:val="0"/>
-          <w:i w:val="0"/>
-          <w:color w:val="000000"/>
-          <w:sz w:val="21"/>
-        </w:rPr>
-        <w:t xml:space="preserve"> menggunakan Vertex AI. Kueri percakapan sederhana chatbot atau sapaan ringan ditangani oleh model berbiaya rendah dan latensi ultra-rendah yaitu </w:t>
-      </w:r>
-      <w:r>
-        <w:rPr>
-          <w:rFonts w:ascii="Arial" w:hAnsi="Arial"/>
-          <w:b/>
-          <w:i w:val="0"/>
-          <w:color w:val="000000"/>
-          <w:sz w:val="21"/>
-        </w:rPr>
-        <w:t>Gemini 2.5 Flash Lite</w:t>
-      </w:r>
-      <w:r>
-        <w:rPr>
-          <w:rFonts w:ascii="Arial" w:hAnsi="Arial"/>
-          <w:b w:val="0"/>
-          <w:i w:val="0"/>
-          <w:color w:val="000000"/>
-          <w:sz w:val="21"/>
-        </w:rPr>
-        <w:t xml:space="preserve">. Sebaliknya, kueri kompleks yang membutuhkan analisis regulasi hukum panjang, dokumen pembanding RAG, atau klasifikasi otomatis foto sampah menjadi metadata JSON diarahkan ke model dengan kemampuan penalaran tinggi yaitu </w:t>
-      </w:r>
-      <w:r>
-        <w:rPr>
-          <w:rFonts w:ascii="Arial" w:hAnsi="Arial"/>
-          <w:b/>
-          <w:i w:val="0"/>
-          <w:color w:val="000000"/>
-          <w:sz w:val="21"/>
-        </w:rPr>
-        <w:t>Gemini 3.5 Flash</w:t>
-      </w:r>
-      <w:r>
-        <w:rPr>
-          <w:rFonts w:ascii="Arial" w:hAnsi="Arial"/>
-          <w:b w:val="0"/>
-          <w:i w:val="0"/>
-          <w:color w:val="000000"/>
-          <w:sz w:val="21"/>
-        </w:rPr>
-        <w:t>. Hal ini memastikan sistem berjalan secara efisien, responsif, dan berorientasi pada dampak nyata aksi iklim lokal.</w:t>
+        <w:t>Guna mengoptimalkan latensi server dan efisiensi biaya, sistem menerapkan pola perutean model AI dinamis (dynamic model routing). Kueri percakapan chatbot yang sederhana diproses secara otomatis oleh model berbiaya rendah dengan latensi ultra-rendah yaitu Gemini 2.5 Flash Lite. Sebaliknya, kueri kompleks yang membutuhkan penalaran regulasi hukum panjang, dokumen pembanding RAG, atau klasifikasi foto sampah menjadi metadata JSON diarahkan ke model dengan kapasitas penalaran tinggi yaitu Gemini 3.5 Flash. Pendekatan perutean model dinamis ini menghasilkan efisiensi sumber daya dan keamanan data, membentuk landasan yang kokoh untuk aksi iklim lokal.</w:t>
       </w:r>
     </w:p>
     <w:p>
       <w:pPr>
-        <w:keepNext/>
-        <w:spacing w:before="360" w:after="120" w:line="276" w:lineRule="auto"/>
-        <w:jc w:val="left"/>
+        <w:spacing w:before="120" w:after="120"/>
+        <w:jc w:val="center"/>
+      </w:pPr>
+      <w:r>
+        <w:drawing>
+          <wp:inline xmlns:a="http://schemas.openxmlformats.org/drawingml/2006/main" xmlns:pic="http://schemas.openxmlformats.org/drawingml/2006/picture">
+            <wp:extent cx="4860000" cy="4860000"/>
+            <wp:docPr id="1" name="Picture 1"/>
+            <wp:cNvGraphicFramePr>
+              <a:graphicFrameLocks noChangeAspect="1"/>
+            </wp:cNvGraphicFramePr>
+            <a:graphic>
+              <a:graphicData uri="http://schemas.openxmlformats.org/drawingml/2006/picture">
+                <pic:pic>
+                  <pic:nvPicPr>
+                    <pic:cNvPr id="0" name="technical_architecture_diagram_1782888262343.png"/>
+                    <pic:cNvPicPr/>
+                  </pic:nvPicPr>
+                  <pic:blipFill>
+                    <a:blip r:embed="rId11"/>
+                    <a:stretch>
+                      <a:fillRect/>
+                    </a:stretch>
+                  </pic:blipFill>
+                  <pic:spPr>
+                    <a:xfrm>
+                      <a:off x="0" y="0"/>
+                      <a:ext cx="4860000" cy="4860000"/>
+                    </a:xfrm>
+                    <a:prstGeom prst="rect"/>
+                  </pic:spPr>
+                </pic:pic>
+              </a:graphicData>
+            </a:graphic>
+          </wp:inline>
+        </w:drawing>
+      </w:r>
+    </w:p>
+    <w:p>
+      <w:pPr>
+        <w:spacing w:before="60" w:after="120" w:line="240" w:lineRule="auto"/>
+        <w:jc w:val="center"/>
       </w:pPr>
       <w:r>
         <w:rPr>
           <w:rFonts w:ascii="Arial" w:hAnsi="Arial"/>
-          <w:b/>
-          <w:color w:val="0A2240"/>
-          <w:sz w:val="28"/>
+          <w:i/>
+          <w:color w:val="555555"/>
+          <w:sz w:val="18"/>
         </w:rPr>
-        <w:t>Description of project and tasks</w:t>
-      </w:r>
-    </w:p>
-    <w:p>
-      <w:pPr>
-        <w:spacing w:before="0" w:after="120" w:line="276" w:lineRule="auto"/>
-        <w:jc w:val="both"/>
-      </w:pPr>
-      <w:r>
-        <w:rPr>
-          <w:rFonts w:ascii="Arial" w:hAnsi="Arial"/>
-          <w:b w:val="0"/>
-          <w:i w:val="0"/>
-          <w:color w:val="000000"/>
-          <w:sz w:val="21"/>
-        </w:rPr>
-        <w:t>Proyek uji ini dirancang untuk menguji kompetensi holistik peserta dalam bidang Kecerdasan Artifisial. Peserta diwajibkan menyelesaikan seluruh milestones yang dibagi ke dalam 4 modul deliverables:</w:t>
-      </w:r>
-    </w:p>
-    <w:p>
-      <w:pPr>
-        <w:keepNext/>
-        <w:spacing w:before="240" w:after="80" w:line="276" w:lineRule="auto"/>
-        <w:jc w:val="left"/>
-      </w:pPr>
-      <w:r>
-        <w:rPr>
-          <w:rFonts w:ascii="Arial" w:hAnsi="Arial"/>
-          <w:b/>
-          <w:color w:val="000000"/>
-          <w:sz w:val="24"/>
-        </w:rPr>
-        <w:t>Module A: Mobile Client &amp; UI Gamifikasi (Flutter)</w:t>
-      </w:r>
-    </w:p>
-    <w:p>
-      <w:pPr>
-        <w:spacing w:before="0" w:after="120" w:line="276" w:lineRule="auto"/>
-        <w:jc w:val="both"/>
-      </w:pPr>
-      <w:r>
-        <w:rPr>
-          <w:rFonts w:ascii="Arial" w:hAnsi="Arial"/>
-          <w:b w:val="0"/>
-          <w:i w:val="0"/>
-          <w:color w:val="000000"/>
-          <w:sz w:val="21"/>
-        </w:rPr>
-        <w:t>Kompetitor harus membangun antarmuka mobile warga menggunakan Flutter dengan arsitektur bersih dan manajemen status BLoC. Deliverables wajib meliputi: (1) Halaman pelaporan sampah yang mengambil foto kamera dan melampirkan metadata koordinat GPS secara otomatis via geolocator; (2) Tampilan gamifikasi interaktif yang menyajikan data poin pengalaman (XP), akumulasi level warga, lencana (badges), dan papan peringkat (leaderboard) secara real-time.</w:t>
-      </w:r>
-    </w:p>
-    <w:p>
-      <w:pPr>
-        <w:keepNext/>
-        <w:spacing w:before="240" w:after="80" w:line="276" w:lineRule="auto"/>
-        <w:jc w:val="left"/>
-      </w:pPr>
-      <w:r>
-        <w:rPr>
-          <w:rFonts w:ascii="Arial" w:hAnsi="Arial"/>
-          <w:b/>
-          <w:color w:val="000000"/>
-          <w:sz w:val="24"/>
-        </w:rPr>
-        <w:t>Module B: Backend API &amp; Integrasi Database (NestJS + Supabase)</w:t>
-      </w:r>
-    </w:p>
-    <w:p>
-      <w:pPr>
-        <w:spacing w:before="0" w:after="120" w:line="276" w:lineRule="auto"/>
-        <w:jc w:val="both"/>
-      </w:pPr>
-      <w:r>
-        <w:rPr>
-          <w:rFonts w:ascii="Arial" w:hAnsi="Arial"/>
-          <w:b w:val="0"/>
-          <w:i w:val="0"/>
-          <w:color w:val="000000"/>
-          <w:sz w:val="21"/>
-        </w:rPr>
-        <w:t>Kompetitor harus mengimplementasikan API RESTful menggunakan NestJS Fastify. Deliverables wajib meliputi: (1) Endpoint autentikasi dan pendaftaran berbasis JWT token; (2) Skema otorisasi berbasis peran (RBAC) untuk membedakan rute menu warga (citizen) dan menu pengelola (admin); (3) Integrasi Supabase PostgreSQL sebagai pusat penyimpanan data relasional.</w:t>
-      </w:r>
-    </w:p>
-    <w:p>
-      <w:pPr>
-        <w:keepNext/>
-        <w:spacing w:before="240" w:after="80" w:line="276" w:lineRule="auto"/>
-        <w:jc w:val="left"/>
-      </w:pPr>
-      <w:r>
-        <w:rPr>
-          <w:rFonts w:ascii="Arial" w:hAnsi="Arial"/>
-          <w:b/>
-          <w:color w:val="000000"/>
-          <w:sz w:val="24"/>
-        </w:rPr>
-        <w:t>Module C: Deteksi Spasial Anti-Spam &amp; Sensor Gambar Privasi (PII)</w:t>
-      </w:r>
-    </w:p>
-    <w:p>
-      <w:pPr>
-        <w:spacing w:before="0" w:after="120" w:line="276" w:lineRule="auto"/>
-        <w:jc w:val="both"/>
-      </w:pPr>
-      <w:r>
-        <w:rPr>
-          <w:rFonts w:ascii="Arial" w:hAnsi="Arial"/>
-          <w:b w:val="0"/>
-          <w:i w:val="0"/>
-          <w:color w:val="000000"/>
-          <w:sz w:val="21"/>
-        </w:rPr>
-        <w:t xml:space="preserve">Kompetitor mengonfigurasikan modul keamanan data dan sanitasi laporan. Deliverables wajib meliputi: (1) Fungsi database PostGIS </w:t>
-      </w:r>
-      <w:r>
-        <w:rPr>
-          <w:rFonts w:ascii="Arial" w:hAnsi="Arial"/>
-          <w:b w:val="0"/>
-          <w:i/>
-          <w:color w:val="000000"/>
-          <w:sz w:val="21"/>
-        </w:rPr>
-        <w:t>check_duplicate_report()</w:t>
-      </w:r>
-      <w:r>
-        <w:rPr>
-          <w:rFonts w:ascii="Arial" w:hAnsi="Arial"/>
-          <w:b w:val="0"/>
-          <w:i w:val="0"/>
-          <w:color w:val="000000"/>
-          <w:sz w:val="21"/>
-        </w:rPr>
-        <w:t xml:space="preserve"> untuk membandingkan koordinat laporan baru dengan laporan aktif dalam radius 50 meter dan rentang waktu 12 jam guna mencegah duplikasi data; (2) Sensor gambar otomatis berbasis Google Vision API untuk mendeteksi koordinat bounding box wajah manusia dan plat nomor kendaraan; (3) Modul Sharp untuk menerapkan Gaussian Blur destruktif secara in-memory sebelum buffer gambar diunggah ke Google Cloud Storage (GCS).</w:t>
-      </w:r>
-    </w:p>
-    <w:p>
-      <w:pPr>
-        <w:keepNext/>
-        <w:spacing w:before="240" w:after="80" w:line="276" w:lineRule="auto"/>
-        <w:jc w:val="left"/>
-      </w:pPr>
-      <w:r>
-        <w:rPr>
-          <w:rFonts w:ascii="Arial" w:hAnsi="Arial"/>
-          <w:b/>
-          <w:color w:val="000000"/>
-          <w:sz w:val="24"/>
-        </w:rPr>
-        <w:t>Module D: RAG Chatbot &amp; Dynamic Model Routing</w:t>
-      </w:r>
-    </w:p>
-    <w:p>
-      <w:pPr>
-        <w:spacing w:before="0" w:after="120" w:line="276" w:lineRule="auto"/>
-        <w:jc w:val="both"/>
-      </w:pPr>
-      <w:r>
-        <w:rPr>
-          <w:rFonts w:ascii="Arial" w:hAnsi="Arial"/>
-          <w:b w:val="0"/>
-          <w:i w:val="0"/>
-          <w:color w:val="000000"/>
-          <w:sz w:val="21"/>
-        </w:rPr>
-        <w:t>Kompetitor merancang asisten hukum regulasi lingkungan hidup menggunakan pgvector dan Gemini Embedding. Deliverables wajib meliputi: (1) Pencarian kesamaan kosinus pada indeks vektor HNSW untuk mencari pasal hukum yang relevan; (2) Modul transkripsi suara warga berbasis Whisper-1; (3) Pengontrol perutean model AI (Model Router) yang secara dinamis mengalihkan kueri pendek ke Gemini 2.5 Flash Lite dan kueri analisis dokumen ke Gemini 3.5 Flash; (4) Respons streaming data menggunakan Server-Sent Events (SSE).</w:t>
+        <w:t>Gambar 1. Diagram arsitektur teknis dan alur data AI pada platform Genesis.</w:t>
       </w:r>
     </w:p>
     <w:p>
@@ -494,7 +289,7 @@
           <w:color w:val="0A2240"/>
           <w:sz w:val="28"/>
         </w:rPr>
-        <w:t>Instructions to the Competitor</w:t>
+        <w:t>Deskripsi Proyek dan Tugas</w:t>
       </w:r>
     </w:p>
     <w:p>
@@ -510,2669 +305,179 @@
           <w:color w:val="000000"/>
           <w:sz w:val="21"/>
         </w:rPr>
-        <w:t>Berikut adalah instruksi pengerjaan teknis rinci yang wajib diikuti oleh kompetitor untuk menyelesaikan setiap modul:</w:t>
+        <w:t>Proyek uji ini dirancang untuk menguji kompetensi peserta dalam integrasi Kecerdasan Artifisial, pengembangan full-stack, dan rekayasa data. Peserta wajib menyelesaikan empat modul kompetensi utama:</w:t>
       </w:r>
     </w:p>
-    <w:tbl>
-      <w:tblPr>
-        <w:tblW w:type="auto" w:w="0"/>
-        <w:jc w:val="center"/>
-        <w:tblLayout w:type="fixed"/>
-        <w:tblLook w:firstColumn="1" w:firstRow="1" w:lastColumn="0" w:lastRow="0" w:noHBand="0" w:noVBand="1" w:val="04A0"/>
-      </w:tblPr>
-      <w:tblGrid>
-        <w:gridCol w:w="2929"/>
-        <w:gridCol w:w="2929"/>
-        <w:gridCol w:w="2929"/>
-      </w:tblGrid>
-      <w:tr>
-        <w:tc>
-          <w:tcPr>
-            <w:tcW w:type="dxa" w:w="1134"/>
-            <w:tcMar>
-              <w:top w:w="100" w:type="dxa"/>
-              <w:bottom w:w="100" w:type="dxa"/>
-              <w:left w:w="120" w:type="dxa"/>
-              <w:right w:w="120" w:type="dxa"/>
-            </w:tcMar>
-            <w:shd w:fill="F2F2F2"/>
-            <w:tcBorders>
-              <w:top w:val="single" w:sz="4" w:space="0" w:color="CCCCCC"/>
-              <w:bottom w:val="single" w:sz="4" w:space="0" w:color="CCCCCC"/>
-              <w:left w:val="single" w:sz="4" w:space="0" w:color="CCCCCC"/>
-              <w:right w:val="single" w:sz="4" w:space="0" w:color="CCCCCC"/>
-            </w:tcBorders>
-            <w:vAlign w:val="center"/>
-          </w:tcPr>
-          <w:p>
-            <w:pPr>
-              <w:spacing w:before="0" w:after="0" w:line="252" w:lineRule="auto"/>
-              <w:jc w:val="center"/>
-            </w:pPr>
-            <w:r/>
-            <w:r>
-              <w:rPr>
-                <w:rFonts w:ascii="Arial" w:hAnsi="Arial"/>
-                <w:b/>
-                <w:i w:val="0"/>
-                <w:color w:val="000000"/>
-                <w:sz w:val="19"/>
-              </w:rPr>
-              <w:t xml:space="preserve">Modul </w:t>
-            </w:r>
-          </w:p>
-        </w:tc>
-        <w:tc>
-          <w:tcPr>
-            <w:tcW w:type="dxa" w:w="4252"/>
-            <w:tcMar>
-              <w:top w:w="100" w:type="dxa"/>
-              <w:bottom w:w="100" w:type="dxa"/>
-              <w:left w:w="120" w:type="dxa"/>
-              <w:right w:w="120" w:type="dxa"/>
-            </w:tcMar>
-            <w:shd w:fill="F2F2F2"/>
-            <w:tcBorders>
-              <w:top w:val="single" w:sz="4" w:space="0" w:color="CCCCCC"/>
-              <w:bottom w:val="single" w:sz="4" w:space="0" w:color="CCCCCC"/>
-              <w:left w:val="single" w:sz="4" w:space="0" w:color="CCCCCC"/>
-              <w:right w:val="single" w:sz="4" w:space="0" w:color="CCCCCC"/>
-            </w:tcBorders>
-            <w:vAlign w:val="center"/>
-          </w:tcPr>
-          <w:p>
-            <w:pPr>
-              <w:spacing w:before="0" w:after="0" w:line="252" w:lineRule="auto"/>
-              <w:jc w:val="center"/>
-            </w:pPr>
-            <w:r/>
-            <w:r>
-              <w:rPr>
-                <w:rFonts w:ascii="Arial" w:hAnsi="Arial"/>
-                <w:b/>
-                <w:i w:val="0"/>
-                <w:color w:val="000000"/>
-                <w:sz w:val="19"/>
-              </w:rPr>
-              <w:t xml:space="preserve">Instruksi </w:t>
-            </w:r>
-            <w:r>
-              <w:rPr>
-                <w:rFonts w:ascii="Arial" w:hAnsi="Arial"/>
-                <w:b/>
-                <w:i w:val="0"/>
-                <w:color w:val="000000"/>
-                <w:sz w:val="19"/>
-              </w:rPr>
-              <w:t xml:space="preserve">Kerja </w:t>
-            </w:r>
-            <w:r>
-              <w:rPr>
-                <w:rFonts w:ascii="Arial" w:hAnsi="Arial"/>
-                <w:b/>
-                <w:i w:val="0"/>
-                <w:color w:val="000000"/>
-                <w:sz w:val="19"/>
-              </w:rPr>
-              <w:t xml:space="preserve">&amp; </w:t>
-            </w:r>
-            <w:r>
-              <w:rPr>
-                <w:rFonts w:ascii="Arial" w:hAnsi="Arial"/>
-                <w:b/>
-                <w:i w:val="0"/>
-                <w:color w:val="000000"/>
-                <w:sz w:val="19"/>
-              </w:rPr>
-              <w:t xml:space="preserve">Spesifikasi </w:t>
-            </w:r>
-            <w:r>
-              <w:rPr>
-                <w:rFonts w:ascii="Arial" w:hAnsi="Arial"/>
-                <w:b/>
-                <w:i w:val="0"/>
-                <w:color w:val="000000"/>
-                <w:sz w:val="19"/>
-              </w:rPr>
-              <w:t xml:space="preserve">Teknis </w:t>
-            </w:r>
-          </w:p>
-        </w:tc>
-        <w:tc>
-          <w:tcPr>
-            <w:tcW w:type="dxa" w:w="3402"/>
-            <w:tcMar>
-              <w:top w:w="100" w:type="dxa"/>
-              <w:bottom w:w="100" w:type="dxa"/>
-              <w:left w:w="120" w:type="dxa"/>
-              <w:right w:w="120" w:type="dxa"/>
-            </w:tcMar>
-            <w:shd w:fill="F2F2F2"/>
-            <w:tcBorders>
-              <w:top w:val="single" w:sz="4" w:space="0" w:color="CCCCCC"/>
-              <w:bottom w:val="single" w:sz="4" w:space="0" w:color="CCCCCC"/>
-              <w:left w:val="single" w:sz="4" w:space="0" w:color="CCCCCC"/>
-              <w:right w:val="single" w:sz="4" w:space="0" w:color="CCCCCC"/>
-            </w:tcBorders>
-            <w:vAlign w:val="center"/>
-          </w:tcPr>
-          <w:p>
-            <w:pPr>
-              <w:spacing w:before="0" w:after="0" w:line="252" w:lineRule="auto"/>
-              <w:jc w:val="center"/>
-            </w:pPr>
-            <w:r/>
-            <w:r>
-              <w:rPr>
-                <w:rFonts w:ascii="Arial" w:hAnsi="Arial"/>
-                <w:b/>
-                <w:i w:val="0"/>
-                <w:color w:val="000000"/>
-                <w:sz w:val="19"/>
-              </w:rPr>
-              <w:t xml:space="preserve">Kriteria </w:t>
-            </w:r>
-            <w:r>
-              <w:rPr>
-                <w:rFonts w:ascii="Arial" w:hAnsi="Arial"/>
-                <w:b/>
-                <w:i w:val="0"/>
-                <w:color w:val="000000"/>
-                <w:sz w:val="19"/>
-              </w:rPr>
-              <w:t xml:space="preserve">Evaluasi </w:t>
-            </w:r>
-            <w:r>
-              <w:rPr>
-                <w:rFonts w:ascii="Arial" w:hAnsi="Arial"/>
-                <w:b/>
-                <w:i w:val="0"/>
-                <w:color w:val="000000"/>
-                <w:sz w:val="19"/>
-              </w:rPr>
-              <w:t xml:space="preserve">&amp; </w:t>
-            </w:r>
-            <w:r>
-              <w:rPr>
-                <w:rFonts w:ascii="Arial" w:hAnsi="Arial"/>
-                <w:b/>
-                <w:i w:val="0"/>
-                <w:color w:val="000000"/>
-                <w:sz w:val="19"/>
-              </w:rPr>
-              <w:t xml:space="preserve">Keberhasilan </w:t>
-            </w:r>
-          </w:p>
-        </w:tc>
-      </w:tr>
-      <w:tr>
-        <w:tc>
-          <w:tcPr>
-            <w:tcW w:type="dxa" w:w="1134"/>
-            <w:tcMar>
-              <w:top w:w="100" w:type="dxa"/>
-              <w:bottom w:w="100" w:type="dxa"/>
-              <w:left w:w="120" w:type="dxa"/>
-              <w:right w:w="120" w:type="dxa"/>
-            </w:tcMar>
-            <w:tcBorders>
-              <w:top w:val="single" w:sz="4" w:space="0" w:color="CCCCCC"/>
-              <w:bottom w:val="single" w:sz="4" w:space="0" w:color="CCCCCC"/>
-              <w:left w:val="single" w:sz="4" w:space="0" w:color="CCCCCC"/>
-              <w:right w:val="single" w:sz="4" w:space="0" w:color="CCCCCC"/>
-            </w:tcBorders>
-            <w:vAlign w:val="center"/>
-          </w:tcPr>
-          <w:p>
-            <w:pPr>
-              <w:spacing w:before="0" w:after="0" w:line="252" w:lineRule="auto"/>
-              <w:jc w:val="center"/>
-            </w:pPr>
-            <w:r/>
-            <w:r>
-              <w:rPr>
-                <w:rFonts w:ascii="Arial" w:hAnsi="Arial"/>
-                <w:b/>
-                <w:i w:val="0"/>
-                <w:color w:val="000000"/>
-                <w:sz w:val="19"/>
-              </w:rPr>
-              <w:t xml:space="preserve">Modul </w:t>
-            </w:r>
-            <w:r>
-              <w:rPr>
-                <w:rFonts w:ascii="Arial" w:hAnsi="Arial"/>
-                <w:b/>
-                <w:i w:val="0"/>
-                <w:color w:val="000000"/>
-                <w:sz w:val="19"/>
-              </w:rPr>
-              <w:t xml:space="preserve">A </w:t>
-            </w:r>
-          </w:p>
-        </w:tc>
-        <w:tc>
-          <w:tcPr>
-            <w:tcW w:type="dxa" w:w="4252"/>
-            <w:tcMar>
-              <w:top w:w="100" w:type="dxa"/>
-              <w:bottom w:w="100" w:type="dxa"/>
-              <w:left w:w="120" w:type="dxa"/>
-              <w:right w:w="120" w:type="dxa"/>
-            </w:tcMar>
-            <w:tcBorders>
-              <w:top w:val="single" w:sz="4" w:space="0" w:color="CCCCCC"/>
-              <w:bottom w:val="single" w:sz="4" w:space="0" w:color="CCCCCC"/>
-              <w:left w:val="single" w:sz="4" w:space="0" w:color="CCCCCC"/>
-              <w:right w:val="single" w:sz="4" w:space="0" w:color="CCCCCC"/>
-            </w:tcBorders>
-            <w:vAlign w:val="center"/>
-          </w:tcPr>
-          <w:p>
-            <w:pPr>
-              <w:spacing w:before="0" w:after="0" w:line="252" w:lineRule="auto"/>
-              <w:jc w:val="left"/>
-            </w:pPr>
-            <w:r/>
-            <w:r>
-              <w:rPr>
-                <w:rFonts w:ascii="Arial" w:hAnsi="Arial"/>
-                <w:b w:val="0"/>
-                <w:i w:val="0"/>
-                <w:color w:val="000000"/>
-                <w:sz w:val="19"/>
-              </w:rPr>
-              <w:t xml:space="preserve">1. </w:t>
-            </w:r>
-            <w:r>
-              <w:rPr>
-                <w:rFonts w:ascii="Arial" w:hAnsi="Arial"/>
-                <w:b w:val="0"/>
-                <w:i w:val="0"/>
-                <w:color w:val="000000"/>
-                <w:sz w:val="19"/>
-              </w:rPr>
-              <w:t xml:space="preserve">Konfigurasikan </w:t>
-            </w:r>
-            <w:r>
-              <w:rPr>
-                <w:rFonts w:ascii="Arial" w:hAnsi="Arial"/>
-                <w:b w:val="0"/>
-                <w:i/>
-                <w:color w:val="000000"/>
-                <w:sz w:val="19"/>
-              </w:rPr>
-              <w:t xml:space="preserve">Geolocator </w:t>
-            </w:r>
-            <w:r>
-              <w:rPr>
-                <w:rFonts w:ascii="Arial" w:hAnsi="Arial"/>
-                <w:b w:val="0"/>
-                <w:i w:val="0"/>
-                <w:color w:val="000000"/>
-                <w:sz w:val="19"/>
-              </w:rPr>
-              <w:t xml:space="preserve">Flutter </w:t>
-            </w:r>
-            <w:r>
-              <w:rPr>
-                <w:rFonts w:ascii="Arial" w:hAnsi="Arial"/>
-                <w:b w:val="0"/>
-                <w:i w:val="0"/>
-                <w:color w:val="000000"/>
-                <w:sz w:val="19"/>
-              </w:rPr>
-              <w:t xml:space="preserve">untuk </w:t>
-            </w:r>
-            <w:r>
-              <w:rPr>
-                <w:rFonts w:ascii="Arial" w:hAnsi="Arial"/>
-                <w:b w:val="0"/>
-                <w:i w:val="0"/>
-                <w:color w:val="000000"/>
-                <w:sz w:val="19"/>
-              </w:rPr>
-              <w:t xml:space="preserve">mengambil </w:t>
-            </w:r>
-            <w:r>
-              <w:rPr>
-                <w:rFonts w:ascii="Arial" w:hAnsi="Arial"/>
-                <w:b w:val="0"/>
-                <w:i w:val="0"/>
-                <w:color w:val="000000"/>
-                <w:sz w:val="19"/>
-              </w:rPr>
-              <w:t xml:space="preserve">data </w:t>
-            </w:r>
-            <w:r>
-              <w:rPr>
-                <w:rFonts w:ascii="Arial" w:hAnsi="Arial"/>
-                <w:b w:val="0"/>
-                <w:i w:val="0"/>
-                <w:color w:val="000000"/>
-                <w:sz w:val="19"/>
-              </w:rPr>
-              <w:t xml:space="preserve">garis </w:t>
-            </w:r>
-            <w:r>
-              <w:rPr>
-                <w:rFonts w:ascii="Arial" w:hAnsi="Arial"/>
-                <w:b w:val="0"/>
-                <w:i w:val="0"/>
-                <w:color w:val="000000"/>
-                <w:sz w:val="19"/>
-              </w:rPr>
-              <w:t>lintang/bujur.</w:t>
-              <w:br/>
-              <w:t xml:space="preserve">2. </w:t>
-            </w:r>
-            <w:r>
-              <w:rPr>
-                <w:rFonts w:ascii="Arial" w:hAnsi="Arial"/>
-                <w:b w:val="0"/>
-                <w:i w:val="0"/>
-                <w:color w:val="000000"/>
-                <w:sz w:val="19"/>
-              </w:rPr>
-              <w:t xml:space="preserve">Terapkan </w:t>
-            </w:r>
-            <w:r>
-              <w:rPr>
-                <w:rFonts w:ascii="Arial" w:hAnsi="Arial"/>
-                <w:b w:val="0"/>
-                <w:i w:val="0"/>
-                <w:color w:val="000000"/>
-                <w:sz w:val="19"/>
-              </w:rPr>
-              <w:t xml:space="preserve">state </w:t>
-            </w:r>
-            <w:r>
-              <w:rPr>
-                <w:rFonts w:ascii="Arial" w:hAnsi="Arial"/>
-                <w:b w:val="0"/>
-                <w:i w:val="0"/>
-                <w:color w:val="000000"/>
-                <w:sz w:val="19"/>
-              </w:rPr>
-              <w:t xml:space="preserve">management </w:t>
-            </w:r>
-            <w:r>
-              <w:rPr>
-                <w:rFonts w:ascii="Arial" w:hAnsi="Arial"/>
-                <w:b w:val="0"/>
-                <w:i w:val="0"/>
-                <w:color w:val="000000"/>
-                <w:sz w:val="19"/>
-              </w:rPr>
-              <w:t xml:space="preserve">BLoC </w:t>
-            </w:r>
-            <w:r>
-              <w:rPr>
-                <w:rFonts w:ascii="Arial" w:hAnsi="Arial"/>
-                <w:b w:val="0"/>
-                <w:i w:val="0"/>
-                <w:color w:val="000000"/>
-                <w:sz w:val="19"/>
-              </w:rPr>
-              <w:t xml:space="preserve">untuk </w:t>
-            </w:r>
-            <w:r>
-              <w:rPr>
-                <w:rFonts w:ascii="Arial" w:hAnsi="Arial"/>
-                <w:b w:val="0"/>
-                <w:i w:val="0"/>
-                <w:color w:val="000000"/>
-                <w:sz w:val="19"/>
-              </w:rPr>
-              <w:t xml:space="preserve">melacak </w:t>
-            </w:r>
-            <w:r>
-              <w:rPr>
-                <w:rFonts w:ascii="Arial" w:hAnsi="Arial"/>
-                <w:b w:val="0"/>
-                <w:i w:val="0"/>
-                <w:color w:val="000000"/>
-                <w:sz w:val="19"/>
-              </w:rPr>
-              <w:t xml:space="preserve">riwayat </w:t>
-            </w:r>
-            <w:r>
-              <w:rPr>
-                <w:rFonts w:ascii="Arial" w:hAnsi="Arial"/>
-                <w:b w:val="0"/>
-                <w:i w:val="0"/>
-                <w:color w:val="000000"/>
-                <w:sz w:val="19"/>
-              </w:rPr>
-              <w:t xml:space="preserve">laporan </w:t>
-            </w:r>
-            <w:r>
-              <w:rPr>
-                <w:rFonts w:ascii="Arial" w:hAnsi="Arial"/>
-                <w:b w:val="0"/>
-                <w:i w:val="0"/>
-                <w:color w:val="000000"/>
-                <w:sz w:val="19"/>
-              </w:rPr>
-              <w:t xml:space="preserve">dan </w:t>
-            </w:r>
-            <w:r>
-              <w:rPr>
-                <w:rFonts w:ascii="Arial" w:hAnsi="Arial"/>
-                <w:b w:val="0"/>
-                <w:i w:val="0"/>
-                <w:color w:val="000000"/>
-                <w:sz w:val="19"/>
-              </w:rPr>
-              <w:t xml:space="preserve">data </w:t>
-            </w:r>
-            <w:r>
-              <w:rPr>
-                <w:rFonts w:ascii="Arial" w:hAnsi="Arial"/>
-                <w:b w:val="0"/>
-                <w:i w:val="0"/>
-                <w:color w:val="000000"/>
-                <w:sz w:val="19"/>
-              </w:rPr>
-              <w:t xml:space="preserve">XP </w:t>
-            </w:r>
-            <w:r>
-              <w:rPr>
-                <w:rFonts w:ascii="Arial" w:hAnsi="Arial"/>
-                <w:b w:val="0"/>
-                <w:i w:val="0"/>
-                <w:color w:val="000000"/>
-                <w:sz w:val="19"/>
-              </w:rPr>
-              <w:t>gamifikasi.</w:t>
-              <w:br/>
-              <w:t xml:space="preserve">3. </w:t>
-            </w:r>
-            <w:r>
-              <w:rPr>
-                <w:rFonts w:ascii="Arial" w:hAnsi="Arial"/>
-                <w:b w:val="0"/>
-                <w:i w:val="0"/>
-                <w:color w:val="000000"/>
-                <w:sz w:val="19"/>
-              </w:rPr>
-              <w:t xml:space="preserve">Rancang </w:t>
-            </w:r>
-            <w:r>
-              <w:rPr>
-                <w:rFonts w:ascii="Arial" w:hAnsi="Arial"/>
-                <w:b w:val="0"/>
-                <w:i w:val="0"/>
-                <w:color w:val="000000"/>
-                <w:sz w:val="19"/>
-              </w:rPr>
-              <w:t xml:space="preserve">tampilan </w:t>
-            </w:r>
-            <w:r>
-              <w:rPr>
-                <w:rFonts w:ascii="Arial" w:hAnsi="Arial"/>
-                <w:b w:val="0"/>
-                <w:i w:val="0"/>
-                <w:color w:val="000000"/>
-                <w:sz w:val="19"/>
-              </w:rPr>
-              <w:t xml:space="preserve">leaderboard </w:t>
-            </w:r>
-            <w:r>
-              <w:rPr>
-                <w:rFonts w:ascii="Arial" w:hAnsi="Arial"/>
-                <w:b w:val="0"/>
-                <w:i w:val="0"/>
-                <w:color w:val="000000"/>
-                <w:sz w:val="19"/>
-              </w:rPr>
-              <w:t xml:space="preserve">dan </w:t>
-            </w:r>
-            <w:r>
-              <w:rPr>
-                <w:rFonts w:ascii="Arial" w:hAnsi="Arial"/>
-                <w:b w:val="0"/>
-                <w:i w:val="0"/>
-                <w:color w:val="000000"/>
-                <w:sz w:val="19"/>
-              </w:rPr>
-              <w:t xml:space="preserve">badges </w:t>
-            </w:r>
-            <w:r>
-              <w:rPr>
-                <w:rFonts w:ascii="Arial" w:hAnsi="Arial"/>
-                <w:b w:val="0"/>
-                <w:i w:val="0"/>
-                <w:color w:val="000000"/>
-                <w:sz w:val="19"/>
-              </w:rPr>
-              <w:t xml:space="preserve">menggunakan </w:t>
-            </w:r>
-            <w:r>
-              <w:rPr>
-                <w:rFonts w:ascii="Arial" w:hAnsi="Arial"/>
-                <w:b w:val="0"/>
-                <w:i w:val="0"/>
-                <w:color w:val="000000"/>
-                <w:sz w:val="19"/>
-              </w:rPr>
-              <w:t xml:space="preserve">custom </w:t>
-            </w:r>
-            <w:r>
-              <w:rPr>
-                <w:rFonts w:ascii="Arial" w:hAnsi="Arial"/>
-                <w:b w:val="0"/>
-                <w:i w:val="0"/>
-                <w:color w:val="000000"/>
-                <w:sz w:val="19"/>
-              </w:rPr>
-              <w:t xml:space="preserve">UI </w:t>
-            </w:r>
-            <w:r>
-              <w:rPr>
-                <w:rFonts w:ascii="Arial" w:hAnsi="Arial"/>
-                <w:b w:val="0"/>
-                <w:i w:val="0"/>
-                <w:color w:val="000000"/>
-                <w:sz w:val="19"/>
-              </w:rPr>
-              <w:t xml:space="preserve">widget. </w:t>
-            </w:r>
-          </w:p>
-        </w:tc>
-        <w:tc>
-          <w:tcPr>
-            <w:tcW w:type="dxa" w:w="3402"/>
-            <w:tcMar>
-              <w:top w:w="100" w:type="dxa"/>
-              <w:bottom w:w="100" w:type="dxa"/>
-              <w:left w:w="120" w:type="dxa"/>
-              <w:right w:w="120" w:type="dxa"/>
-            </w:tcMar>
-            <w:tcBorders>
-              <w:top w:val="single" w:sz="4" w:space="0" w:color="CCCCCC"/>
-              <w:bottom w:val="single" w:sz="4" w:space="0" w:color="CCCCCC"/>
-              <w:left w:val="single" w:sz="4" w:space="0" w:color="CCCCCC"/>
-              <w:right w:val="single" w:sz="4" w:space="0" w:color="CCCCCC"/>
-            </w:tcBorders>
-            <w:vAlign w:val="center"/>
-          </w:tcPr>
-          <w:p>
-            <w:pPr>
-              <w:spacing w:before="0" w:after="0" w:line="252" w:lineRule="auto"/>
-              <w:jc w:val="left"/>
-            </w:pPr>
-            <w:r/>
-            <w:r>
-              <w:rPr>
-                <w:rFonts w:ascii="Arial" w:hAnsi="Arial"/>
-                <w:b w:val="0"/>
-                <w:i w:val="0"/>
-                <w:color w:val="000000"/>
-                <w:sz w:val="19"/>
-              </w:rPr>
-              <w:t xml:space="preserve">Aplikasi </w:t>
-            </w:r>
-            <w:r>
-              <w:rPr>
-                <w:rFonts w:ascii="Arial" w:hAnsi="Arial"/>
-                <w:b w:val="0"/>
-                <w:i w:val="0"/>
-                <w:color w:val="000000"/>
-                <w:sz w:val="19"/>
-              </w:rPr>
-              <w:t xml:space="preserve">berhasil </w:t>
-            </w:r>
-            <w:r>
-              <w:rPr>
-                <w:rFonts w:ascii="Arial" w:hAnsi="Arial"/>
-                <w:b w:val="0"/>
-                <w:i w:val="0"/>
-                <w:color w:val="000000"/>
-                <w:sz w:val="19"/>
-              </w:rPr>
-              <w:t xml:space="preserve">menangkap </w:t>
-            </w:r>
-            <w:r>
-              <w:rPr>
-                <w:rFonts w:ascii="Arial" w:hAnsi="Arial"/>
-                <w:b w:val="0"/>
-                <w:i w:val="0"/>
-                <w:color w:val="000000"/>
-                <w:sz w:val="19"/>
-              </w:rPr>
-              <w:t xml:space="preserve">GPS </w:t>
-            </w:r>
-            <w:r>
-              <w:rPr>
-                <w:rFonts w:ascii="Arial" w:hAnsi="Arial"/>
-                <w:b w:val="0"/>
-                <w:i w:val="0"/>
-                <w:color w:val="000000"/>
-                <w:sz w:val="19"/>
-              </w:rPr>
-              <w:t xml:space="preserve">perangkat </w:t>
-            </w:r>
-            <w:r>
-              <w:rPr>
-                <w:rFonts w:ascii="Arial" w:hAnsi="Arial"/>
-                <w:b w:val="0"/>
-                <w:i w:val="0"/>
-                <w:color w:val="000000"/>
-                <w:sz w:val="19"/>
-              </w:rPr>
-              <w:t xml:space="preserve">secara </w:t>
-            </w:r>
-            <w:r>
-              <w:rPr>
-                <w:rFonts w:ascii="Arial" w:hAnsi="Arial"/>
-                <w:b w:val="0"/>
-                <w:i w:val="0"/>
-                <w:color w:val="000000"/>
-                <w:sz w:val="19"/>
-              </w:rPr>
-              <w:t xml:space="preserve">background </w:t>
-            </w:r>
-            <w:r>
-              <w:rPr>
-                <w:rFonts w:ascii="Arial" w:hAnsi="Arial"/>
-                <w:b w:val="0"/>
-                <w:i w:val="0"/>
-                <w:color w:val="000000"/>
-                <w:sz w:val="19"/>
-              </w:rPr>
-              <w:t xml:space="preserve">saat </w:t>
-            </w:r>
-            <w:r>
-              <w:rPr>
-                <w:rFonts w:ascii="Arial" w:hAnsi="Arial"/>
-                <w:b w:val="0"/>
-                <w:i w:val="0"/>
-                <w:color w:val="000000"/>
-                <w:sz w:val="19"/>
-              </w:rPr>
-              <w:t xml:space="preserve">kamera </w:t>
-            </w:r>
-            <w:r>
-              <w:rPr>
-                <w:rFonts w:ascii="Arial" w:hAnsi="Arial"/>
-                <w:b w:val="0"/>
-                <w:i w:val="0"/>
-                <w:color w:val="000000"/>
-                <w:sz w:val="19"/>
-              </w:rPr>
-              <w:t xml:space="preserve">aktif, </w:t>
-            </w:r>
-            <w:r>
-              <w:rPr>
-                <w:rFonts w:ascii="Arial" w:hAnsi="Arial"/>
-                <w:b w:val="0"/>
-                <w:i w:val="0"/>
-                <w:color w:val="000000"/>
-                <w:sz w:val="19"/>
-              </w:rPr>
-              <w:t xml:space="preserve">dan </w:t>
-            </w:r>
-            <w:r>
-              <w:rPr>
-                <w:rFonts w:ascii="Arial" w:hAnsi="Arial"/>
-                <w:b w:val="0"/>
-                <w:i w:val="0"/>
-                <w:color w:val="000000"/>
-                <w:sz w:val="19"/>
-              </w:rPr>
-              <w:t xml:space="preserve">menampilkan </w:t>
-            </w:r>
-            <w:r>
-              <w:rPr>
-                <w:rFonts w:ascii="Arial" w:hAnsi="Arial"/>
-                <w:b w:val="0"/>
-                <w:i w:val="0"/>
-                <w:color w:val="000000"/>
-                <w:sz w:val="19"/>
-              </w:rPr>
-              <w:t xml:space="preserve">riwayat </w:t>
-            </w:r>
-            <w:r>
-              <w:rPr>
-                <w:rFonts w:ascii="Arial" w:hAnsi="Arial"/>
-                <w:b w:val="0"/>
-                <w:i w:val="0"/>
-                <w:color w:val="000000"/>
-                <w:sz w:val="19"/>
-              </w:rPr>
-              <w:t xml:space="preserve">poin </w:t>
-            </w:r>
-            <w:r>
-              <w:rPr>
-                <w:rFonts w:ascii="Arial" w:hAnsi="Arial"/>
-                <w:b w:val="0"/>
-                <w:i w:val="0"/>
-                <w:color w:val="000000"/>
-                <w:sz w:val="19"/>
-              </w:rPr>
-              <w:t xml:space="preserve">dengan </w:t>
-            </w:r>
-            <w:r>
-              <w:rPr>
-                <w:rFonts w:ascii="Arial" w:hAnsi="Arial"/>
-                <w:b w:val="0"/>
-                <w:i w:val="0"/>
-                <w:color w:val="000000"/>
-                <w:sz w:val="19"/>
-              </w:rPr>
-              <w:t xml:space="preserve">state </w:t>
-            </w:r>
-            <w:r>
-              <w:rPr>
-                <w:rFonts w:ascii="Arial" w:hAnsi="Arial"/>
-                <w:b w:val="0"/>
-                <w:i w:val="0"/>
-                <w:color w:val="000000"/>
-                <w:sz w:val="19"/>
-              </w:rPr>
-              <w:t xml:space="preserve">BLoC </w:t>
-            </w:r>
-            <w:r>
-              <w:rPr>
-                <w:rFonts w:ascii="Arial" w:hAnsi="Arial"/>
-                <w:b w:val="0"/>
-                <w:i w:val="0"/>
-                <w:color w:val="000000"/>
-                <w:sz w:val="19"/>
-              </w:rPr>
-              <w:t xml:space="preserve">yang </w:t>
-            </w:r>
-            <w:r>
-              <w:rPr>
-                <w:rFonts w:ascii="Arial" w:hAnsi="Arial"/>
-                <w:b w:val="0"/>
-                <w:i w:val="0"/>
-                <w:color w:val="000000"/>
-                <w:sz w:val="19"/>
-              </w:rPr>
-              <w:t xml:space="preserve">stabil. </w:t>
-            </w:r>
-          </w:p>
-        </w:tc>
-      </w:tr>
-      <w:tr>
-        <w:tc>
-          <w:tcPr>
-            <w:tcW w:type="dxa" w:w="1134"/>
-            <w:tcMar>
-              <w:top w:w="100" w:type="dxa"/>
-              <w:bottom w:w="100" w:type="dxa"/>
-              <w:left w:w="120" w:type="dxa"/>
-              <w:right w:w="120" w:type="dxa"/>
-            </w:tcMar>
-            <w:tcBorders>
-              <w:top w:val="single" w:sz="4" w:space="0" w:color="CCCCCC"/>
-              <w:bottom w:val="single" w:sz="4" w:space="0" w:color="CCCCCC"/>
-              <w:left w:val="single" w:sz="4" w:space="0" w:color="CCCCCC"/>
-              <w:right w:val="single" w:sz="4" w:space="0" w:color="CCCCCC"/>
-            </w:tcBorders>
-            <w:vAlign w:val="center"/>
-          </w:tcPr>
-          <w:p>
-            <w:pPr>
-              <w:spacing w:before="0" w:after="0" w:line="252" w:lineRule="auto"/>
-              <w:jc w:val="center"/>
-            </w:pPr>
-            <w:r/>
-            <w:r>
-              <w:rPr>
-                <w:rFonts w:ascii="Arial" w:hAnsi="Arial"/>
-                <w:b/>
-                <w:i w:val="0"/>
-                <w:color w:val="000000"/>
-                <w:sz w:val="19"/>
-              </w:rPr>
-              <w:t xml:space="preserve">Modul </w:t>
-            </w:r>
-            <w:r>
-              <w:rPr>
-                <w:rFonts w:ascii="Arial" w:hAnsi="Arial"/>
-                <w:b/>
-                <w:i w:val="0"/>
-                <w:color w:val="000000"/>
-                <w:sz w:val="19"/>
-              </w:rPr>
-              <w:t xml:space="preserve">B </w:t>
-            </w:r>
-          </w:p>
-        </w:tc>
-        <w:tc>
-          <w:tcPr>
-            <w:tcW w:type="dxa" w:w="4252"/>
-            <w:tcMar>
-              <w:top w:w="100" w:type="dxa"/>
-              <w:bottom w:w="100" w:type="dxa"/>
-              <w:left w:w="120" w:type="dxa"/>
-              <w:right w:w="120" w:type="dxa"/>
-            </w:tcMar>
-            <w:tcBorders>
-              <w:top w:val="single" w:sz="4" w:space="0" w:color="CCCCCC"/>
-              <w:bottom w:val="single" w:sz="4" w:space="0" w:color="CCCCCC"/>
-              <w:left w:val="single" w:sz="4" w:space="0" w:color="CCCCCC"/>
-              <w:right w:val="single" w:sz="4" w:space="0" w:color="CCCCCC"/>
-            </w:tcBorders>
-            <w:vAlign w:val="center"/>
-          </w:tcPr>
-          <w:p>
-            <w:pPr>
-              <w:spacing w:before="0" w:after="0" w:line="252" w:lineRule="auto"/>
-              <w:jc w:val="left"/>
-            </w:pPr>
-            <w:r/>
-            <w:r>
-              <w:rPr>
-                <w:rFonts w:ascii="Arial" w:hAnsi="Arial"/>
-                <w:b w:val="0"/>
-                <w:i w:val="0"/>
-                <w:color w:val="000000"/>
-                <w:sz w:val="19"/>
-              </w:rPr>
-              <w:t xml:space="preserve">1. </w:t>
-            </w:r>
-            <w:r>
-              <w:rPr>
-                <w:rFonts w:ascii="Arial" w:hAnsi="Arial"/>
-                <w:b w:val="0"/>
-                <w:i w:val="0"/>
-                <w:color w:val="000000"/>
-                <w:sz w:val="19"/>
-              </w:rPr>
-              <w:t xml:space="preserve">Buat </w:t>
-            </w:r>
-            <w:r>
-              <w:rPr>
-                <w:rFonts w:ascii="Arial" w:hAnsi="Arial"/>
-                <w:b w:val="0"/>
-                <w:i w:val="0"/>
-                <w:color w:val="000000"/>
-                <w:sz w:val="19"/>
-              </w:rPr>
-              <w:t xml:space="preserve">REST </w:t>
-            </w:r>
-            <w:r>
-              <w:rPr>
-                <w:rFonts w:ascii="Arial" w:hAnsi="Arial"/>
-                <w:b w:val="0"/>
-                <w:i w:val="0"/>
-                <w:color w:val="000000"/>
-                <w:sz w:val="19"/>
-              </w:rPr>
-              <w:t xml:space="preserve">controller </w:t>
-            </w:r>
-            <w:r>
-              <w:rPr>
-                <w:rFonts w:ascii="Arial" w:hAnsi="Arial"/>
-                <w:b w:val="0"/>
-                <w:i w:val="0"/>
-                <w:color w:val="000000"/>
-                <w:sz w:val="19"/>
-              </w:rPr>
-              <w:t xml:space="preserve">NestJS </w:t>
-            </w:r>
-            <w:r>
-              <w:rPr>
-                <w:rFonts w:ascii="Arial" w:hAnsi="Arial"/>
-                <w:b w:val="0"/>
-                <w:i w:val="0"/>
-                <w:color w:val="000000"/>
-                <w:sz w:val="19"/>
-              </w:rPr>
-              <w:t xml:space="preserve">menggunakan </w:t>
-            </w:r>
-            <w:r>
-              <w:rPr>
-                <w:rFonts w:ascii="Arial" w:hAnsi="Arial"/>
-                <w:b w:val="0"/>
-                <w:i w:val="0"/>
-                <w:color w:val="000000"/>
-                <w:sz w:val="19"/>
-              </w:rPr>
-              <w:t xml:space="preserve">adapter </w:t>
-            </w:r>
-            <w:r>
-              <w:rPr>
-                <w:rFonts w:ascii="Arial" w:hAnsi="Arial"/>
-                <w:b w:val="0"/>
-                <w:i w:val="0"/>
-                <w:color w:val="000000"/>
-                <w:sz w:val="19"/>
-              </w:rPr>
-              <w:t>Fastify.</w:t>
-              <w:br/>
-              <w:t xml:space="preserve">2. </w:t>
-            </w:r>
-            <w:r>
-              <w:rPr>
-                <w:rFonts w:ascii="Arial" w:hAnsi="Arial"/>
-                <w:b w:val="0"/>
-                <w:i w:val="0"/>
-                <w:color w:val="000000"/>
-                <w:sz w:val="19"/>
-              </w:rPr>
-              <w:t xml:space="preserve">Hubungkan </w:t>
-            </w:r>
-            <w:r>
-              <w:rPr>
-                <w:rFonts w:ascii="Arial" w:hAnsi="Arial"/>
-                <w:b w:val="0"/>
-                <w:i w:val="0"/>
-                <w:color w:val="000000"/>
-                <w:sz w:val="19"/>
-              </w:rPr>
-              <w:t xml:space="preserve">service </w:t>
-            </w:r>
-            <w:r>
-              <w:rPr>
-                <w:rFonts w:ascii="Arial" w:hAnsi="Arial"/>
-                <w:b w:val="0"/>
-                <w:i w:val="0"/>
-                <w:color w:val="000000"/>
-                <w:sz w:val="19"/>
-              </w:rPr>
-              <w:t xml:space="preserve">ke </w:t>
-            </w:r>
-            <w:r>
-              <w:rPr>
-                <w:rFonts w:ascii="Arial" w:hAnsi="Arial"/>
-                <w:b w:val="0"/>
-                <w:i/>
-                <w:color w:val="000000"/>
-                <w:sz w:val="19"/>
-              </w:rPr>
-              <w:t xml:space="preserve">database </w:t>
-            </w:r>
-            <w:r>
-              <w:rPr>
-                <w:rFonts w:ascii="Arial" w:hAnsi="Arial"/>
-                <w:b w:val="0"/>
-                <w:i w:val="0"/>
-                <w:color w:val="000000"/>
-                <w:sz w:val="19"/>
-              </w:rPr>
-              <w:t xml:space="preserve">PostgreSQL </w:t>
-            </w:r>
-            <w:r>
-              <w:rPr>
-                <w:rFonts w:ascii="Arial" w:hAnsi="Arial"/>
-                <w:b w:val="0"/>
-                <w:i w:val="0"/>
-                <w:color w:val="000000"/>
-                <w:sz w:val="19"/>
-              </w:rPr>
-              <w:t>Supabase.</w:t>
-              <w:br/>
-              <w:t xml:space="preserve">3. </w:t>
-            </w:r>
-            <w:r>
-              <w:rPr>
-                <w:rFonts w:ascii="Arial" w:hAnsi="Arial"/>
-                <w:b w:val="0"/>
-                <w:i w:val="0"/>
-                <w:color w:val="000000"/>
-                <w:sz w:val="19"/>
-              </w:rPr>
-              <w:t xml:space="preserve">Implementasikan </w:t>
-            </w:r>
-            <w:r>
-              <w:rPr>
-                <w:rFonts w:ascii="Arial" w:hAnsi="Arial"/>
-                <w:b w:val="0"/>
-                <w:i w:val="0"/>
-                <w:color w:val="000000"/>
-                <w:sz w:val="19"/>
-              </w:rPr>
-              <w:t xml:space="preserve">AuthGuard </w:t>
-            </w:r>
-            <w:r>
-              <w:rPr>
-                <w:rFonts w:ascii="Arial" w:hAnsi="Arial"/>
-                <w:b w:val="0"/>
-                <w:i w:val="0"/>
-                <w:color w:val="000000"/>
-                <w:sz w:val="19"/>
-              </w:rPr>
-              <w:t xml:space="preserve">menggunakan </w:t>
-            </w:r>
-            <w:r>
-              <w:rPr>
-                <w:rFonts w:ascii="Arial" w:hAnsi="Arial"/>
-                <w:b w:val="0"/>
-                <w:i w:val="0"/>
-                <w:color w:val="000000"/>
-                <w:sz w:val="19"/>
-              </w:rPr>
-              <w:t xml:space="preserve">Passport </w:t>
-            </w:r>
-            <w:r>
-              <w:rPr>
-                <w:rFonts w:ascii="Arial" w:hAnsi="Arial"/>
-                <w:b w:val="0"/>
-                <w:i/>
-                <w:color w:val="000000"/>
-                <w:sz w:val="19"/>
-              </w:rPr>
-              <w:t xml:space="preserve">JWT </w:t>
-            </w:r>
-            <w:r>
-              <w:rPr>
-                <w:rFonts w:ascii="Arial" w:hAnsi="Arial"/>
-                <w:b w:val="0"/>
-                <w:i w:val="0"/>
-                <w:color w:val="000000"/>
-                <w:sz w:val="19"/>
-              </w:rPr>
-              <w:t xml:space="preserve">dan </w:t>
-            </w:r>
-            <w:r>
-              <w:rPr>
-                <w:rFonts w:ascii="Arial" w:hAnsi="Arial"/>
-                <w:b w:val="0"/>
-                <w:i w:val="0"/>
-                <w:color w:val="000000"/>
-                <w:sz w:val="19"/>
-              </w:rPr>
-              <w:t xml:space="preserve">RolesGuard </w:t>
-            </w:r>
-            <w:r>
-              <w:rPr>
-                <w:rFonts w:ascii="Arial" w:hAnsi="Arial"/>
-                <w:b w:val="0"/>
-                <w:i w:val="0"/>
-                <w:color w:val="000000"/>
-                <w:sz w:val="19"/>
-              </w:rPr>
-              <w:t xml:space="preserve">berbasis </w:t>
-            </w:r>
-            <w:r>
-              <w:rPr>
-                <w:rFonts w:ascii="Arial" w:hAnsi="Arial"/>
-                <w:b w:val="0"/>
-                <w:i w:val="0"/>
-                <w:color w:val="000000"/>
-                <w:sz w:val="19"/>
-              </w:rPr>
-              <w:t xml:space="preserve">metadata </w:t>
-            </w:r>
-            <w:r>
-              <w:rPr>
-                <w:rFonts w:ascii="Arial" w:hAnsi="Arial"/>
-                <w:b w:val="0"/>
-                <w:i w:val="0"/>
-                <w:color w:val="000000"/>
-                <w:sz w:val="19"/>
-              </w:rPr>
-              <w:t xml:space="preserve">role. </w:t>
-            </w:r>
-          </w:p>
-        </w:tc>
-        <w:tc>
-          <w:tcPr>
-            <w:tcW w:type="dxa" w:w="3402"/>
-            <w:tcMar>
-              <w:top w:w="100" w:type="dxa"/>
-              <w:bottom w:w="100" w:type="dxa"/>
-              <w:left w:w="120" w:type="dxa"/>
-              <w:right w:w="120" w:type="dxa"/>
-            </w:tcMar>
-            <w:tcBorders>
-              <w:top w:val="single" w:sz="4" w:space="0" w:color="CCCCCC"/>
-              <w:bottom w:val="single" w:sz="4" w:space="0" w:color="CCCCCC"/>
-              <w:left w:val="single" w:sz="4" w:space="0" w:color="CCCCCC"/>
-              <w:right w:val="single" w:sz="4" w:space="0" w:color="CCCCCC"/>
-            </w:tcBorders>
-            <w:vAlign w:val="center"/>
-          </w:tcPr>
-          <w:p>
-            <w:pPr>
-              <w:spacing w:before="0" w:after="0" w:line="252" w:lineRule="auto"/>
-              <w:jc w:val="left"/>
-            </w:pPr>
-            <w:r/>
-            <w:r>
-              <w:rPr>
-                <w:rFonts w:ascii="Arial" w:hAnsi="Arial"/>
-                <w:b w:val="0"/>
-                <w:i w:val="0"/>
-                <w:color w:val="000000"/>
-                <w:sz w:val="19"/>
-              </w:rPr>
-              <w:t xml:space="preserve">API </w:t>
-            </w:r>
-            <w:r>
-              <w:rPr>
-                <w:rFonts w:ascii="Arial" w:hAnsi="Arial"/>
-                <w:b w:val="0"/>
-                <w:i w:val="0"/>
-                <w:color w:val="000000"/>
-                <w:sz w:val="19"/>
-              </w:rPr>
-              <w:t xml:space="preserve">merespons </w:t>
-            </w:r>
-            <w:r>
-              <w:rPr>
-                <w:rFonts w:ascii="Arial" w:hAnsi="Arial"/>
-                <w:b w:val="0"/>
-                <w:i w:val="0"/>
-                <w:color w:val="000000"/>
-                <w:sz w:val="19"/>
-              </w:rPr>
-              <w:t xml:space="preserve">request </w:t>
-            </w:r>
-            <w:r>
-              <w:rPr>
-                <w:rFonts w:ascii="Arial" w:hAnsi="Arial"/>
-                <w:b w:val="0"/>
-                <w:i w:val="0"/>
-                <w:color w:val="000000"/>
-                <w:sz w:val="19"/>
-              </w:rPr>
-              <w:t xml:space="preserve">dalam </w:t>
-            </w:r>
-            <w:r>
-              <w:rPr>
-                <w:rFonts w:ascii="Arial" w:hAnsi="Arial"/>
-                <w:b w:val="0"/>
-                <w:i w:val="0"/>
-                <w:color w:val="000000"/>
-                <w:sz w:val="19"/>
-              </w:rPr>
-              <w:t xml:space="preserve">&lt;150ms. </w:t>
-            </w:r>
-            <w:r>
-              <w:rPr>
-                <w:rFonts w:ascii="Arial" w:hAnsi="Arial"/>
-                <w:b w:val="0"/>
-                <w:i w:val="0"/>
-                <w:color w:val="000000"/>
-                <w:sz w:val="19"/>
-              </w:rPr>
-              <w:t xml:space="preserve">Request </w:t>
-            </w:r>
-            <w:r>
-              <w:rPr>
-                <w:rFonts w:ascii="Arial" w:hAnsi="Arial"/>
-                <w:b w:val="0"/>
-                <w:i w:val="0"/>
-                <w:color w:val="000000"/>
-                <w:sz w:val="19"/>
-              </w:rPr>
-              <w:t xml:space="preserve">tanpa </w:t>
-            </w:r>
-            <w:r>
-              <w:rPr>
-                <w:rFonts w:ascii="Arial" w:hAnsi="Arial"/>
-                <w:b w:val="0"/>
-                <w:i w:val="0"/>
-                <w:color w:val="000000"/>
-                <w:sz w:val="19"/>
-              </w:rPr>
-              <w:t xml:space="preserve">Authorization </w:t>
-            </w:r>
-            <w:r>
-              <w:rPr>
-                <w:rFonts w:ascii="Arial" w:hAnsi="Arial"/>
-                <w:b w:val="0"/>
-                <w:i w:val="0"/>
-                <w:color w:val="000000"/>
-                <w:sz w:val="19"/>
-              </w:rPr>
-              <w:t xml:space="preserve">header </w:t>
-            </w:r>
-            <w:r>
-              <w:rPr>
-                <w:rFonts w:ascii="Arial" w:hAnsi="Arial"/>
-                <w:b w:val="0"/>
-                <w:i w:val="0"/>
-                <w:color w:val="000000"/>
-                <w:sz w:val="19"/>
-              </w:rPr>
-              <w:t xml:space="preserve">Bearer </w:t>
-            </w:r>
-            <w:r>
-              <w:rPr>
-                <w:rFonts w:ascii="Arial" w:hAnsi="Arial"/>
-                <w:b w:val="0"/>
-                <w:i w:val="0"/>
-                <w:color w:val="000000"/>
-                <w:sz w:val="19"/>
-              </w:rPr>
-              <w:t xml:space="preserve">token </w:t>
-            </w:r>
-            <w:r>
-              <w:rPr>
-                <w:rFonts w:ascii="Arial" w:hAnsi="Arial"/>
-                <w:b w:val="0"/>
-                <w:i w:val="0"/>
-                <w:color w:val="000000"/>
-                <w:sz w:val="19"/>
-              </w:rPr>
-              <w:t xml:space="preserve">ditolak </w:t>
-            </w:r>
-            <w:r>
-              <w:rPr>
-                <w:rFonts w:ascii="Arial" w:hAnsi="Arial"/>
-                <w:b w:val="0"/>
-                <w:i w:val="0"/>
-                <w:color w:val="000000"/>
-                <w:sz w:val="19"/>
-              </w:rPr>
-              <w:t xml:space="preserve">dengan </w:t>
-            </w:r>
-            <w:r>
-              <w:rPr>
-                <w:rFonts w:ascii="Arial" w:hAnsi="Arial"/>
-                <w:b w:val="0"/>
-                <w:i w:val="0"/>
-                <w:color w:val="000000"/>
-                <w:sz w:val="19"/>
-              </w:rPr>
-              <w:t xml:space="preserve">HTTP </w:t>
-            </w:r>
-            <w:r>
-              <w:rPr>
-                <w:rFonts w:ascii="Arial" w:hAnsi="Arial"/>
-                <w:b w:val="0"/>
-                <w:i w:val="0"/>
-                <w:color w:val="000000"/>
-                <w:sz w:val="19"/>
-              </w:rPr>
-              <w:t xml:space="preserve">Status </w:t>
-            </w:r>
-            <w:r>
-              <w:rPr>
-                <w:rFonts w:ascii="Arial" w:hAnsi="Arial"/>
-                <w:b w:val="0"/>
-                <w:i w:val="0"/>
-                <w:color w:val="000000"/>
-                <w:sz w:val="19"/>
-              </w:rPr>
-              <w:t xml:space="preserve">401 </w:t>
-            </w:r>
-            <w:r>
-              <w:rPr>
-                <w:rFonts w:ascii="Arial" w:hAnsi="Arial"/>
-                <w:b w:val="0"/>
-                <w:i w:val="0"/>
-                <w:color w:val="000000"/>
-                <w:sz w:val="19"/>
-              </w:rPr>
-              <w:t xml:space="preserve">Unauthorized. </w:t>
-            </w:r>
-          </w:p>
-        </w:tc>
-      </w:tr>
-      <w:tr>
-        <w:tc>
-          <w:tcPr>
-            <w:tcW w:type="dxa" w:w="1134"/>
-            <w:tcMar>
-              <w:top w:w="100" w:type="dxa"/>
-              <w:bottom w:w="100" w:type="dxa"/>
-              <w:left w:w="120" w:type="dxa"/>
-              <w:right w:w="120" w:type="dxa"/>
-            </w:tcMar>
-            <w:tcBorders>
-              <w:top w:val="single" w:sz="4" w:space="0" w:color="CCCCCC"/>
-              <w:bottom w:val="single" w:sz="4" w:space="0" w:color="CCCCCC"/>
-              <w:left w:val="single" w:sz="4" w:space="0" w:color="CCCCCC"/>
-              <w:right w:val="single" w:sz="4" w:space="0" w:color="CCCCCC"/>
-            </w:tcBorders>
-            <w:vAlign w:val="center"/>
-          </w:tcPr>
-          <w:p>
-            <w:pPr>
-              <w:spacing w:before="0" w:after="0" w:line="252" w:lineRule="auto"/>
-              <w:jc w:val="center"/>
-            </w:pPr>
-            <w:r/>
-            <w:r>
-              <w:rPr>
-                <w:rFonts w:ascii="Arial" w:hAnsi="Arial"/>
-                <w:b/>
-                <w:i w:val="0"/>
-                <w:color w:val="000000"/>
-                <w:sz w:val="19"/>
-              </w:rPr>
-              <w:t xml:space="preserve">Modul </w:t>
-            </w:r>
-            <w:r>
-              <w:rPr>
-                <w:rFonts w:ascii="Arial" w:hAnsi="Arial"/>
-                <w:b/>
-                <w:i w:val="0"/>
-                <w:color w:val="000000"/>
-                <w:sz w:val="19"/>
-              </w:rPr>
-              <w:t xml:space="preserve">C </w:t>
-            </w:r>
-          </w:p>
-        </w:tc>
-        <w:tc>
-          <w:tcPr>
-            <w:tcW w:type="dxa" w:w="4252"/>
-            <w:tcMar>
-              <w:top w:w="100" w:type="dxa"/>
-              <w:bottom w:w="100" w:type="dxa"/>
-              <w:left w:w="120" w:type="dxa"/>
-              <w:right w:w="120" w:type="dxa"/>
-            </w:tcMar>
-            <w:tcBorders>
-              <w:top w:val="single" w:sz="4" w:space="0" w:color="CCCCCC"/>
-              <w:bottom w:val="single" w:sz="4" w:space="0" w:color="CCCCCC"/>
-              <w:left w:val="single" w:sz="4" w:space="0" w:color="CCCCCC"/>
-              <w:right w:val="single" w:sz="4" w:space="0" w:color="CCCCCC"/>
-            </w:tcBorders>
-            <w:vAlign w:val="center"/>
-          </w:tcPr>
-          <w:p>
-            <w:pPr>
-              <w:spacing w:before="0" w:after="0" w:line="252" w:lineRule="auto"/>
-              <w:jc w:val="left"/>
-            </w:pPr>
-            <w:r/>
-            <w:r>
-              <w:rPr>
-                <w:rFonts w:ascii="Arial" w:hAnsi="Arial"/>
-                <w:b w:val="0"/>
-                <w:i w:val="0"/>
-                <w:color w:val="000000"/>
-                <w:sz w:val="19"/>
-              </w:rPr>
-              <w:t xml:space="preserve">1. </w:t>
-            </w:r>
-            <w:r>
-              <w:rPr>
-                <w:rFonts w:ascii="Arial" w:hAnsi="Arial"/>
-                <w:b w:val="0"/>
-                <w:i w:val="0"/>
-                <w:color w:val="000000"/>
-                <w:sz w:val="19"/>
-              </w:rPr>
-              <w:t xml:space="preserve">Tulis </w:t>
-            </w:r>
-            <w:r>
-              <w:rPr>
-                <w:rFonts w:ascii="Arial" w:hAnsi="Arial"/>
-                <w:b w:val="0"/>
-                <w:i w:val="0"/>
-                <w:color w:val="000000"/>
-                <w:sz w:val="19"/>
-              </w:rPr>
-              <w:t xml:space="preserve">stored </w:t>
-            </w:r>
-            <w:r>
-              <w:rPr>
-                <w:rFonts w:ascii="Arial" w:hAnsi="Arial"/>
-                <w:b w:val="0"/>
-                <w:i w:val="0"/>
-                <w:color w:val="000000"/>
-                <w:sz w:val="19"/>
-              </w:rPr>
-              <w:t xml:space="preserve">procedure </w:t>
-            </w:r>
-            <w:r>
-              <w:rPr>
-                <w:rFonts w:ascii="Arial" w:hAnsi="Arial"/>
-                <w:b w:val="0"/>
-                <w:i w:val="0"/>
-                <w:color w:val="000000"/>
-                <w:sz w:val="19"/>
-              </w:rPr>
-              <w:t xml:space="preserve">SQL </w:t>
-            </w:r>
-            <w:r>
-              <w:rPr>
-                <w:rFonts w:ascii="Arial" w:hAnsi="Arial"/>
-                <w:b w:val="0"/>
-                <w:i w:val="0"/>
-                <w:color w:val="000000"/>
-                <w:sz w:val="19"/>
-              </w:rPr>
-              <w:t xml:space="preserve">PostGIS </w:t>
-            </w:r>
-            <w:r>
-              <w:rPr>
-                <w:rFonts w:ascii="Arial" w:hAnsi="Arial"/>
-                <w:b w:val="0"/>
-                <w:i w:val="0"/>
-                <w:color w:val="000000"/>
-                <w:sz w:val="19"/>
-              </w:rPr>
-              <w:t xml:space="preserve">menggunakan </w:t>
-            </w:r>
-            <w:r>
-              <w:rPr>
-                <w:rFonts w:ascii="Arial" w:hAnsi="Arial"/>
-                <w:b w:val="0"/>
-                <w:i w:val="0"/>
-                <w:color w:val="000000"/>
-                <w:sz w:val="19"/>
-              </w:rPr>
-              <w:t xml:space="preserve">fungsi </w:t>
-            </w:r>
-            <w:r>
-              <w:rPr>
-                <w:rFonts w:ascii="Arial" w:hAnsi="Arial"/>
-                <w:b w:val="0"/>
-                <w:i w:val="0"/>
-                <w:color w:val="000000"/>
-                <w:sz w:val="19"/>
-              </w:rPr>
-              <w:t xml:space="preserve">ST_DWithin </w:t>
-            </w:r>
-            <w:r>
-              <w:rPr>
-                <w:rFonts w:ascii="Arial" w:hAnsi="Arial"/>
-                <w:b w:val="0"/>
-                <w:i w:val="0"/>
-                <w:color w:val="000000"/>
-                <w:sz w:val="19"/>
-              </w:rPr>
-              <w:t xml:space="preserve">untuk </w:t>
-            </w:r>
-            <w:r>
-              <w:rPr>
-                <w:rFonts w:ascii="Arial" w:hAnsi="Arial"/>
-                <w:b w:val="0"/>
-                <w:i w:val="0"/>
-                <w:color w:val="000000"/>
-                <w:sz w:val="19"/>
-              </w:rPr>
-              <w:t xml:space="preserve">perbandingan </w:t>
-            </w:r>
-            <w:r>
-              <w:rPr>
-                <w:rFonts w:ascii="Arial" w:hAnsi="Arial"/>
-                <w:b w:val="0"/>
-                <w:i w:val="0"/>
-                <w:color w:val="000000"/>
-                <w:sz w:val="19"/>
-              </w:rPr>
-              <w:t xml:space="preserve">jarak </w:t>
-            </w:r>
-            <w:r>
-              <w:rPr>
-                <w:rFonts w:ascii="Arial" w:hAnsi="Arial"/>
-                <w:b w:val="0"/>
-                <w:i w:val="0"/>
-                <w:color w:val="000000"/>
-                <w:sz w:val="19"/>
-              </w:rPr>
-              <w:t>spasial.</w:t>
-              <w:br/>
-              <w:t xml:space="preserve">2. </w:t>
-            </w:r>
-            <w:r>
-              <w:rPr>
-                <w:rFonts w:ascii="Arial" w:hAnsi="Arial"/>
-                <w:b w:val="0"/>
-                <w:i w:val="0"/>
-                <w:color w:val="000000"/>
-                <w:sz w:val="19"/>
-              </w:rPr>
-              <w:t xml:space="preserve">Kirim </w:t>
-            </w:r>
-            <w:r>
-              <w:rPr>
-                <w:rFonts w:ascii="Arial" w:hAnsi="Arial"/>
-                <w:b w:val="0"/>
-                <w:i w:val="0"/>
-                <w:color w:val="000000"/>
-                <w:sz w:val="19"/>
-              </w:rPr>
-              <w:t xml:space="preserve">gambar </w:t>
-            </w:r>
-            <w:r>
-              <w:rPr>
-                <w:rFonts w:ascii="Arial" w:hAnsi="Arial"/>
-                <w:b w:val="0"/>
-                <w:i w:val="0"/>
-                <w:color w:val="000000"/>
-                <w:sz w:val="19"/>
-              </w:rPr>
-              <w:t xml:space="preserve">ke </w:t>
-            </w:r>
-            <w:r>
-              <w:rPr>
-                <w:rFonts w:ascii="Arial" w:hAnsi="Arial"/>
-                <w:b w:val="0"/>
-                <w:i w:val="0"/>
-                <w:color w:val="000000"/>
-                <w:sz w:val="19"/>
-              </w:rPr>
-              <w:t xml:space="preserve">Google </w:t>
-            </w:r>
-            <w:r>
-              <w:rPr>
-                <w:rFonts w:ascii="Arial" w:hAnsi="Arial"/>
-                <w:b w:val="0"/>
-                <w:i/>
-                <w:color w:val="000000"/>
-                <w:sz w:val="19"/>
-              </w:rPr>
-              <w:t xml:space="preserve">Vision </w:t>
-            </w:r>
-            <w:r>
-              <w:rPr>
-                <w:rFonts w:ascii="Arial" w:hAnsi="Arial"/>
-                <w:b w:val="0"/>
-                <w:i w:val="0"/>
-                <w:color w:val="000000"/>
-                <w:sz w:val="19"/>
-              </w:rPr>
-              <w:t xml:space="preserve">API, </w:t>
-            </w:r>
-            <w:r>
-              <w:rPr>
-                <w:rFonts w:ascii="Arial" w:hAnsi="Arial"/>
-                <w:b w:val="0"/>
-                <w:i w:val="0"/>
-                <w:color w:val="000000"/>
-                <w:sz w:val="19"/>
-              </w:rPr>
-              <w:t xml:space="preserve">deteksi </w:t>
-            </w:r>
-            <w:r>
-              <w:rPr>
-                <w:rFonts w:ascii="Arial" w:hAnsi="Arial"/>
-                <w:b w:val="0"/>
-                <w:i w:val="0"/>
-                <w:color w:val="000000"/>
-                <w:sz w:val="19"/>
-              </w:rPr>
-              <w:t xml:space="preserve">bounding </w:t>
-            </w:r>
-            <w:r>
-              <w:rPr>
-                <w:rFonts w:ascii="Arial" w:hAnsi="Arial"/>
-                <w:b w:val="0"/>
-                <w:i w:val="0"/>
-                <w:color w:val="000000"/>
-                <w:sz w:val="19"/>
-              </w:rPr>
-              <w:t xml:space="preserve">box </w:t>
-            </w:r>
-            <w:r>
-              <w:rPr>
-                <w:rFonts w:ascii="Arial" w:hAnsi="Arial"/>
-                <w:b w:val="0"/>
-                <w:i w:val="0"/>
-                <w:color w:val="000000"/>
-                <w:sz w:val="19"/>
-              </w:rPr>
-              <w:t xml:space="preserve">wajah/plat </w:t>
-            </w:r>
-            <w:r>
-              <w:rPr>
-                <w:rFonts w:ascii="Arial" w:hAnsi="Arial"/>
-                <w:b w:val="0"/>
-                <w:i w:val="0"/>
-                <w:color w:val="000000"/>
-                <w:sz w:val="19"/>
-              </w:rPr>
-              <w:t>nomor.</w:t>
-              <w:br/>
-              <w:t xml:space="preserve">3. </w:t>
-            </w:r>
-            <w:r>
-              <w:rPr>
-                <w:rFonts w:ascii="Arial" w:hAnsi="Arial"/>
-                <w:b w:val="0"/>
-                <w:i w:val="0"/>
-                <w:color w:val="000000"/>
-                <w:sz w:val="19"/>
-              </w:rPr>
-              <w:t xml:space="preserve">Olah </w:t>
-            </w:r>
-            <w:r>
-              <w:rPr>
-                <w:rFonts w:ascii="Arial" w:hAnsi="Arial"/>
-                <w:b w:val="0"/>
-                <w:i w:val="0"/>
-                <w:color w:val="000000"/>
-                <w:sz w:val="19"/>
-              </w:rPr>
-              <w:t xml:space="preserve">buffer </w:t>
-            </w:r>
-            <w:r>
-              <w:rPr>
-                <w:rFonts w:ascii="Arial" w:hAnsi="Arial"/>
-                <w:b w:val="0"/>
-                <w:i w:val="0"/>
-                <w:color w:val="000000"/>
-                <w:sz w:val="19"/>
-              </w:rPr>
-              <w:t xml:space="preserve">gambar </w:t>
-            </w:r>
-            <w:r>
-              <w:rPr>
-                <w:rFonts w:ascii="Arial" w:hAnsi="Arial"/>
-                <w:b w:val="0"/>
-                <w:i w:val="0"/>
-                <w:color w:val="000000"/>
-                <w:sz w:val="19"/>
-              </w:rPr>
-              <w:t xml:space="preserve">menggunakan </w:t>
-            </w:r>
-            <w:r>
-              <w:rPr>
-                <w:rFonts w:ascii="Arial" w:hAnsi="Arial"/>
-                <w:b w:val="0"/>
-                <w:i/>
-                <w:color w:val="000000"/>
-                <w:sz w:val="19"/>
-              </w:rPr>
-              <w:t xml:space="preserve">Sharp </w:t>
-            </w:r>
-            <w:r>
-              <w:rPr>
-                <w:rFonts w:ascii="Arial" w:hAnsi="Arial"/>
-                <w:b w:val="0"/>
-                <w:i w:val="0"/>
-                <w:color w:val="000000"/>
-                <w:sz w:val="19"/>
-              </w:rPr>
-              <w:t xml:space="preserve">langsung </w:t>
-            </w:r>
-            <w:r>
-              <w:rPr>
-                <w:rFonts w:ascii="Arial" w:hAnsi="Arial"/>
-                <w:b w:val="0"/>
-                <w:i w:val="0"/>
-                <w:color w:val="000000"/>
-                <w:sz w:val="19"/>
-              </w:rPr>
-              <w:t xml:space="preserve">di </w:t>
-            </w:r>
-            <w:r>
-              <w:rPr>
-                <w:rFonts w:ascii="Arial" w:hAnsi="Arial"/>
-                <w:b w:val="0"/>
-                <w:i w:val="0"/>
-                <w:color w:val="000000"/>
-                <w:sz w:val="19"/>
-              </w:rPr>
-              <w:t xml:space="preserve">memori </w:t>
-            </w:r>
-            <w:r>
-              <w:rPr>
-                <w:rFonts w:ascii="Arial" w:hAnsi="Arial"/>
-                <w:b w:val="0"/>
-                <w:i w:val="0"/>
-                <w:color w:val="000000"/>
-                <w:sz w:val="19"/>
-              </w:rPr>
-              <w:t xml:space="preserve">server. </w:t>
-            </w:r>
-          </w:p>
-        </w:tc>
-        <w:tc>
-          <w:tcPr>
-            <w:tcW w:type="dxa" w:w="3402"/>
-            <w:tcMar>
-              <w:top w:w="100" w:type="dxa"/>
-              <w:bottom w:w="100" w:type="dxa"/>
-              <w:left w:w="120" w:type="dxa"/>
-              <w:right w:w="120" w:type="dxa"/>
-            </w:tcMar>
-            <w:tcBorders>
-              <w:top w:val="single" w:sz="4" w:space="0" w:color="CCCCCC"/>
-              <w:bottom w:val="single" w:sz="4" w:space="0" w:color="CCCCCC"/>
-              <w:left w:val="single" w:sz="4" w:space="0" w:color="CCCCCC"/>
-              <w:right w:val="single" w:sz="4" w:space="0" w:color="CCCCCC"/>
-            </w:tcBorders>
-            <w:vAlign w:val="center"/>
-          </w:tcPr>
-          <w:p>
-            <w:pPr>
-              <w:spacing w:before="0" w:after="0" w:line="252" w:lineRule="auto"/>
-              <w:jc w:val="left"/>
-            </w:pPr>
-            <w:r/>
-            <w:r>
-              <w:rPr>
-                <w:rFonts w:ascii="Arial" w:hAnsi="Arial"/>
-                <w:b w:val="0"/>
-                <w:i w:val="0"/>
-                <w:color w:val="000000"/>
-                <w:sz w:val="19"/>
-              </w:rPr>
-              <w:t xml:space="preserve">Fungsi </w:t>
-            </w:r>
-            <w:r>
-              <w:rPr>
-                <w:rFonts w:ascii="Arial" w:hAnsi="Arial"/>
-                <w:b w:val="0"/>
-                <w:i/>
-                <w:color w:val="000000"/>
-                <w:sz w:val="19"/>
-              </w:rPr>
-              <w:t xml:space="preserve">check_duplicate_report() </w:t>
-            </w:r>
-            <w:r>
-              <w:rPr>
-                <w:rFonts w:ascii="Arial" w:hAnsi="Arial"/>
-                <w:b w:val="0"/>
-                <w:i w:val="0"/>
-                <w:color w:val="000000"/>
-                <w:sz w:val="19"/>
-              </w:rPr>
-              <w:t xml:space="preserve">mendeteksi </w:t>
-            </w:r>
-            <w:r>
-              <w:rPr>
-                <w:rFonts w:ascii="Arial" w:hAnsi="Arial"/>
-                <w:b w:val="0"/>
-                <w:i w:val="0"/>
-                <w:color w:val="000000"/>
-                <w:sz w:val="19"/>
-              </w:rPr>
-              <w:t xml:space="preserve">spam </w:t>
-            </w:r>
-            <w:r>
-              <w:rPr>
-                <w:rFonts w:ascii="Arial" w:hAnsi="Arial"/>
-                <w:b w:val="0"/>
-                <w:i w:val="0"/>
-                <w:color w:val="000000"/>
-                <w:sz w:val="19"/>
-              </w:rPr>
-              <w:t xml:space="preserve">dengan </w:t>
-            </w:r>
-            <w:r>
-              <w:rPr>
-                <w:rFonts w:ascii="Arial" w:hAnsi="Arial"/>
-                <w:b w:val="0"/>
-                <w:i w:val="0"/>
-                <w:color w:val="000000"/>
-                <w:sz w:val="19"/>
-              </w:rPr>
-              <w:t xml:space="preserve">tepat. </w:t>
-            </w:r>
-            <w:r>
-              <w:rPr>
-                <w:rFonts w:ascii="Arial" w:hAnsi="Arial"/>
-                <w:b w:val="0"/>
-                <w:i w:val="0"/>
-                <w:color w:val="000000"/>
-                <w:sz w:val="19"/>
-              </w:rPr>
-              <w:t xml:space="preserve">Gambar </w:t>
-            </w:r>
-            <w:r>
-              <w:rPr>
-                <w:rFonts w:ascii="Arial" w:hAnsi="Arial"/>
-                <w:b w:val="0"/>
-                <w:i w:val="0"/>
-                <w:color w:val="000000"/>
-                <w:sz w:val="19"/>
-              </w:rPr>
-              <w:t xml:space="preserve">tersimpan </w:t>
-            </w:r>
-            <w:r>
-              <w:rPr>
-                <w:rFonts w:ascii="Arial" w:hAnsi="Arial"/>
-                <w:b w:val="0"/>
-                <w:i w:val="0"/>
-                <w:color w:val="000000"/>
-                <w:sz w:val="19"/>
-              </w:rPr>
-              <w:t xml:space="preserve">di </w:t>
-            </w:r>
-            <w:r>
-              <w:rPr>
-                <w:rFonts w:ascii="Arial" w:hAnsi="Arial"/>
-                <w:b w:val="0"/>
-                <w:i w:val="0"/>
-                <w:color w:val="000000"/>
-                <w:sz w:val="19"/>
-              </w:rPr>
-              <w:t xml:space="preserve">GCS </w:t>
-            </w:r>
-            <w:r>
-              <w:rPr>
-                <w:rFonts w:ascii="Arial" w:hAnsi="Arial"/>
-                <w:b w:val="0"/>
-                <w:i w:val="0"/>
-                <w:color w:val="000000"/>
-                <w:sz w:val="19"/>
-              </w:rPr>
-              <w:t xml:space="preserve">terbukti </w:t>
-            </w:r>
-            <w:r>
-              <w:rPr>
-                <w:rFonts w:ascii="Arial" w:hAnsi="Arial"/>
-                <w:b w:val="0"/>
-                <w:i w:val="0"/>
-                <w:color w:val="000000"/>
-                <w:sz w:val="19"/>
-              </w:rPr>
-              <w:t xml:space="preserve">telah </w:t>
-            </w:r>
-            <w:r>
-              <w:rPr>
-                <w:rFonts w:ascii="Arial" w:hAnsi="Arial"/>
-                <w:b w:val="0"/>
-                <w:i w:val="0"/>
-                <w:color w:val="000000"/>
-                <w:sz w:val="19"/>
-              </w:rPr>
-              <w:t xml:space="preserve">tersensor </w:t>
-            </w:r>
-            <w:r>
-              <w:rPr>
-                <w:rFonts w:ascii="Arial" w:hAnsi="Arial"/>
-                <w:b w:val="0"/>
-                <w:i w:val="0"/>
-                <w:color w:val="000000"/>
-                <w:sz w:val="19"/>
-              </w:rPr>
-              <w:t xml:space="preserve">pada </w:t>
-            </w:r>
-            <w:r>
-              <w:rPr>
-                <w:rFonts w:ascii="Arial" w:hAnsi="Arial"/>
-                <w:b w:val="0"/>
-                <w:i w:val="0"/>
-                <w:color w:val="000000"/>
-                <w:sz w:val="19"/>
-              </w:rPr>
-              <w:t xml:space="preserve">wajah/plat </w:t>
-            </w:r>
-            <w:r>
-              <w:rPr>
-                <w:rFonts w:ascii="Arial" w:hAnsi="Arial"/>
-                <w:b w:val="0"/>
-                <w:i w:val="0"/>
-                <w:color w:val="000000"/>
-                <w:sz w:val="19"/>
-              </w:rPr>
-              <w:t xml:space="preserve">nomor. </w:t>
-            </w:r>
-          </w:p>
-        </w:tc>
-      </w:tr>
-      <w:tr>
-        <w:tc>
-          <w:tcPr>
-            <w:tcW w:type="dxa" w:w="1134"/>
-            <w:tcMar>
-              <w:top w:w="100" w:type="dxa"/>
-              <w:bottom w:w="100" w:type="dxa"/>
-              <w:left w:w="120" w:type="dxa"/>
-              <w:right w:w="120" w:type="dxa"/>
-            </w:tcMar>
-            <w:tcBorders>
-              <w:top w:val="single" w:sz="4" w:space="0" w:color="CCCCCC"/>
-              <w:bottom w:val="single" w:sz="4" w:space="0" w:color="CCCCCC"/>
-              <w:left w:val="single" w:sz="4" w:space="0" w:color="CCCCCC"/>
-              <w:right w:val="single" w:sz="4" w:space="0" w:color="CCCCCC"/>
-            </w:tcBorders>
-            <w:vAlign w:val="center"/>
-          </w:tcPr>
-          <w:p>
-            <w:pPr>
-              <w:spacing w:before="0" w:after="0" w:line="252" w:lineRule="auto"/>
-              <w:jc w:val="center"/>
-            </w:pPr>
-            <w:r/>
-            <w:r>
-              <w:rPr>
-                <w:rFonts w:ascii="Arial" w:hAnsi="Arial"/>
-                <w:b/>
-                <w:i w:val="0"/>
-                <w:color w:val="000000"/>
-                <w:sz w:val="19"/>
-              </w:rPr>
-              <w:t xml:space="preserve">Modul </w:t>
-            </w:r>
-            <w:r>
-              <w:rPr>
-                <w:rFonts w:ascii="Arial" w:hAnsi="Arial"/>
-                <w:b/>
-                <w:i w:val="0"/>
-                <w:color w:val="000000"/>
-                <w:sz w:val="19"/>
-              </w:rPr>
-              <w:t xml:space="preserve">D </w:t>
-            </w:r>
-          </w:p>
-        </w:tc>
-        <w:tc>
-          <w:tcPr>
-            <w:tcW w:type="dxa" w:w="4252"/>
-            <w:tcMar>
-              <w:top w:w="100" w:type="dxa"/>
-              <w:bottom w:w="100" w:type="dxa"/>
-              <w:left w:w="120" w:type="dxa"/>
-              <w:right w:w="120" w:type="dxa"/>
-            </w:tcMar>
-            <w:tcBorders>
-              <w:top w:val="single" w:sz="4" w:space="0" w:color="CCCCCC"/>
-              <w:bottom w:val="single" w:sz="4" w:space="0" w:color="CCCCCC"/>
-              <w:left w:val="single" w:sz="4" w:space="0" w:color="CCCCCC"/>
-              <w:right w:val="single" w:sz="4" w:space="0" w:color="CCCCCC"/>
-            </w:tcBorders>
-            <w:vAlign w:val="center"/>
-          </w:tcPr>
-          <w:p>
-            <w:pPr>
-              <w:spacing w:before="0" w:after="0" w:line="252" w:lineRule="auto"/>
-              <w:jc w:val="left"/>
-            </w:pPr>
-            <w:r/>
-            <w:r>
-              <w:rPr>
-                <w:rFonts w:ascii="Arial" w:hAnsi="Arial"/>
-                <w:b w:val="0"/>
-                <w:i w:val="0"/>
-                <w:color w:val="000000"/>
-                <w:sz w:val="19"/>
-              </w:rPr>
-              <w:t xml:space="preserve">1. </w:t>
-            </w:r>
-            <w:r>
-              <w:rPr>
-                <w:rFonts w:ascii="Arial" w:hAnsi="Arial"/>
-                <w:b w:val="0"/>
-                <w:i w:val="0"/>
-                <w:color w:val="000000"/>
-                <w:sz w:val="19"/>
-              </w:rPr>
-              <w:t xml:space="preserve">Konfigurasikan </w:t>
-            </w:r>
-            <w:r>
-              <w:rPr>
-                <w:rFonts w:ascii="Arial" w:hAnsi="Arial"/>
-                <w:b w:val="0"/>
-                <w:i w:val="0"/>
-                <w:color w:val="000000"/>
-                <w:sz w:val="19"/>
-              </w:rPr>
-              <w:t xml:space="preserve">tabel </w:t>
-            </w:r>
-            <w:r>
-              <w:rPr>
-                <w:rFonts w:ascii="Arial" w:hAnsi="Arial"/>
-                <w:b w:val="0"/>
-                <w:i/>
-                <w:color w:val="000000"/>
-                <w:sz w:val="19"/>
-              </w:rPr>
-              <w:t xml:space="preserve">pgvector </w:t>
-            </w:r>
-            <w:r>
-              <w:rPr>
-                <w:rFonts w:ascii="Arial" w:hAnsi="Arial"/>
-                <w:b w:val="0"/>
-                <w:i w:val="0"/>
-                <w:color w:val="000000"/>
-                <w:sz w:val="19"/>
-              </w:rPr>
-              <w:t xml:space="preserve">Supabase </w:t>
-            </w:r>
-            <w:r>
-              <w:rPr>
-                <w:rFonts w:ascii="Arial" w:hAnsi="Arial"/>
-                <w:b w:val="0"/>
-                <w:i w:val="0"/>
-                <w:color w:val="000000"/>
-                <w:sz w:val="19"/>
-              </w:rPr>
-              <w:t xml:space="preserve">dengan </w:t>
-            </w:r>
-            <w:r>
-              <w:rPr>
-                <w:rFonts w:ascii="Arial" w:hAnsi="Arial"/>
-                <w:b w:val="0"/>
-                <w:i/>
-                <w:color w:val="000000"/>
-                <w:sz w:val="19"/>
-              </w:rPr>
-              <w:t xml:space="preserve">embedding </w:t>
-            </w:r>
-            <w:r>
-              <w:rPr>
-                <w:rFonts w:ascii="Arial" w:hAnsi="Arial"/>
-                <w:b w:val="0"/>
-                <w:i w:val="0"/>
-                <w:color w:val="000000"/>
-                <w:sz w:val="19"/>
-              </w:rPr>
-              <w:t xml:space="preserve">768 </w:t>
-            </w:r>
-            <w:r>
-              <w:rPr>
-                <w:rFonts w:ascii="Arial" w:hAnsi="Arial"/>
-                <w:b w:val="0"/>
-                <w:i w:val="0"/>
-                <w:color w:val="000000"/>
-                <w:sz w:val="19"/>
-              </w:rPr>
-              <w:t>dimensi.</w:t>
-              <w:br/>
-              <w:t xml:space="preserve">2. </w:t>
-            </w:r>
-            <w:r>
-              <w:rPr>
-                <w:rFonts w:ascii="Arial" w:hAnsi="Arial"/>
-                <w:b w:val="0"/>
-                <w:i w:val="0"/>
-                <w:color w:val="000000"/>
-                <w:sz w:val="19"/>
-              </w:rPr>
-              <w:t xml:space="preserve">Buat </w:t>
-            </w:r>
-            <w:r>
-              <w:rPr>
-                <w:rFonts w:ascii="Arial" w:hAnsi="Arial"/>
-                <w:b w:val="0"/>
-                <w:i w:val="0"/>
-                <w:color w:val="000000"/>
-                <w:sz w:val="19"/>
-              </w:rPr>
-              <w:t xml:space="preserve">fungsi </w:t>
-            </w:r>
-            <w:r>
-              <w:rPr>
-                <w:rFonts w:ascii="Arial" w:hAnsi="Arial"/>
-                <w:b w:val="0"/>
-                <w:i w:val="0"/>
-                <w:color w:val="000000"/>
-                <w:sz w:val="19"/>
-              </w:rPr>
-              <w:t xml:space="preserve">Model </w:t>
-            </w:r>
-            <w:r>
-              <w:rPr>
-                <w:rFonts w:ascii="Arial" w:hAnsi="Arial"/>
-                <w:b w:val="0"/>
-                <w:i w:val="0"/>
-                <w:color w:val="000000"/>
-                <w:sz w:val="19"/>
-              </w:rPr>
-              <w:t xml:space="preserve">Router </w:t>
-            </w:r>
-            <w:r>
-              <w:rPr>
-                <w:rFonts w:ascii="Arial" w:hAnsi="Arial"/>
-                <w:b w:val="0"/>
-                <w:i w:val="0"/>
-                <w:color w:val="000000"/>
-                <w:sz w:val="19"/>
-              </w:rPr>
-              <w:t xml:space="preserve">yang </w:t>
-            </w:r>
-            <w:r>
-              <w:rPr>
-                <w:rFonts w:ascii="Arial" w:hAnsi="Arial"/>
-                <w:b w:val="0"/>
-                <w:i w:val="0"/>
-                <w:color w:val="000000"/>
-                <w:sz w:val="19"/>
-              </w:rPr>
-              <w:t xml:space="preserve">memeriksa </w:t>
-            </w:r>
-            <w:r>
-              <w:rPr>
-                <w:rFonts w:ascii="Arial" w:hAnsi="Arial"/>
-                <w:b w:val="0"/>
-                <w:i w:val="0"/>
-                <w:color w:val="000000"/>
-                <w:sz w:val="19"/>
-              </w:rPr>
-              <w:t xml:space="preserve">panjang </w:t>
-            </w:r>
-            <w:r>
-              <w:rPr>
-                <w:rFonts w:ascii="Arial" w:hAnsi="Arial"/>
-                <w:b w:val="0"/>
-                <w:i w:val="0"/>
-                <w:color w:val="000000"/>
-                <w:sz w:val="19"/>
-              </w:rPr>
-              <w:t xml:space="preserve">karakter </w:t>
-            </w:r>
-            <w:r>
-              <w:rPr>
-                <w:rFonts w:ascii="Arial" w:hAnsi="Arial"/>
-                <w:b w:val="0"/>
-                <w:i w:val="0"/>
-                <w:color w:val="000000"/>
-                <w:sz w:val="19"/>
-              </w:rPr>
-              <w:t xml:space="preserve">input </w:t>
-            </w:r>
-            <w:r>
-              <w:rPr>
-                <w:rFonts w:ascii="Arial" w:hAnsi="Arial"/>
-                <w:b w:val="0"/>
-                <w:i w:val="0"/>
-                <w:color w:val="000000"/>
-                <w:sz w:val="19"/>
-              </w:rPr>
-              <w:t xml:space="preserve">(kueri </w:t>
-            </w:r>
-            <w:r>
-              <w:rPr>
-                <w:rFonts w:ascii="Arial" w:hAnsi="Arial"/>
-                <w:b w:val="0"/>
-                <w:i w:val="0"/>
-                <w:color w:val="000000"/>
-                <w:sz w:val="19"/>
-              </w:rPr>
-              <w:t xml:space="preserve">&lt; </w:t>
-            </w:r>
-            <w:r>
-              <w:rPr>
-                <w:rFonts w:ascii="Arial" w:hAnsi="Arial"/>
-                <w:b w:val="0"/>
-                <w:i w:val="0"/>
-                <w:color w:val="000000"/>
-                <w:sz w:val="19"/>
-              </w:rPr>
-              <w:t xml:space="preserve">100 </w:t>
-            </w:r>
-            <w:r>
-              <w:rPr>
-                <w:rFonts w:ascii="Arial" w:hAnsi="Arial"/>
-                <w:b w:val="0"/>
-                <w:i w:val="0"/>
-                <w:color w:val="000000"/>
-                <w:sz w:val="19"/>
-              </w:rPr>
-              <w:t xml:space="preserve">karakter </w:t>
-            </w:r>
-            <w:r>
-              <w:rPr>
-                <w:rFonts w:ascii="Arial" w:hAnsi="Arial"/>
-                <w:b w:val="0"/>
-                <w:i w:val="0"/>
-                <w:color w:val="000000"/>
-                <w:sz w:val="19"/>
-              </w:rPr>
-              <w:t xml:space="preserve">diarahkan </w:t>
-            </w:r>
-            <w:r>
-              <w:rPr>
-                <w:rFonts w:ascii="Arial" w:hAnsi="Arial"/>
-                <w:b w:val="0"/>
-                <w:i w:val="0"/>
-                <w:color w:val="000000"/>
-                <w:sz w:val="19"/>
-              </w:rPr>
-              <w:t xml:space="preserve">ke </w:t>
-            </w:r>
-            <w:r>
-              <w:rPr>
-                <w:rFonts w:ascii="Arial" w:hAnsi="Arial"/>
-                <w:b w:val="0"/>
-                <w:i w:val="0"/>
-                <w:color w:val="000000"/>
-                <w:sz w:val="19"/>
-              </w:rPr>
-              <w:t xml:space="preserve">Gemini </w:t>
-            </w:r>
-            <w:r>
-              <w:rPr>
-                <w:rFonts w:ascii="Arial" w:hAnsi="Arial"/>
-                <w:b w:val="0"/>
-                <w:i w:val="0"/>
-                <w:color w:val="000000"/>
-                <w:sz w:val="19"/>
-              </w:rPr>
-              <w:t xml:space="preserve">2.5 </w:t>
-            </w:r>
-            <w:r>
-              <w:rPr>
-                <w:rFonts w:ascii="Arial" w:hAnsi="Arial"/>
-                <w:b w:val="0"/>
-                <w:i/>
-                <w:color w:val="000000"/>
-                <w:sz w:val="19"/>
-              </w:rPr>
-              <w:t xml:space="preserve">Flash </w:t>
-            </w:r>
-            <w:r>
-              <w:rPr>
-                <w:rFonts w:ascii="Arial" w:hAnsi="Arial"/>
-                <w:b w:val="0"/>
-                <w:i w:val="0"/>
-                <w:color w:val="000000"/>
-                <w:sz w:val="19"/>
-              </w:rPr>
-              <w:t xml:space="preserve">Lite, </w:t>
-            </w:r>
-            <w:r>
-              <w:rPr>
-                <w:rFonts w:ascii="Arial" w:hAnsi="Arial"/>
-                <w:b w:val="0"/>
-                <w:i w:val="0"/>
-                <w:color w:val="000000"/>
-                <w:sz w:val="19"/>
-              </w:rPr>
-              <w:t xml:space="preserve">kueri </w:t>
-            </w:r>
-            <w:r>
-              <w:rPr>
-                <w:rFonts w:ascii="Arial" w:hAnsi="Arial"/>
-                <w:b w:val="0"/>
-                <w:i w:val="0"/>
-                <w:color w:val="000000"/>
-                <w:sz w:val="19"/>
-              </w:rPr>
-              <w:t xml:space="preserve">&gt;= </w:t>
-            </w:r>
-            <w:r>
-              <w:rPr>
-                <w:rFonts w:ascii="Arial" w:hAnsi="Arial"/>
-                <w:b w:val="0"/>
-                <w:i w:val="0"/>
-                <w:color w:val="000000"/>
-                <w:sz w:val="19"/>
-              </w:rPr>
-              <w:t xml:space="preserve">100 </w:t>
-            </w:r>
-            <w:r>
-              <w:rPr>
-                <w:rFonts w:ascii="Arial" w:hAnsi="Arial"/>
-                <w:b w:val="0"/>
-                <w:i w:val="0"/>
-                <w:color w:val="000000"/>
-                <w:sz w:val="19"/>
-              </w:rPr>
-              <w:t xml:space="preserve">karakter </w:t>
-            </w:r>
-            <w:r>
-              <w:rPr>
-                <w:rFonts w:ascii="Arial" w:hAnsi="Arial"/>
-                <w:b w:val="0"/>
-                <w:i w:val="0"/>
-                <w:color w:val="000000"/>
-                <w:sz w:val="19"/>
-              </w:rPr>
-              <w:t xml:space="preserve">atau </w:t>
-            </w:r>
-            <w:r>
-              <w:rPr>
-                <w:rFonts w:ascii="Arial" w:hAnsi="Arial"/>
-                <w:b w:val="0"/>
-                <w:i w:val="0"/>
-                <w:color w:val="000000"/>
-                <w:sz w:val="19"/>
-              </w:rPr>
-              <w:t xml:space="preserve">pencarian </w:t>
-            </w:r>
-            <w:r>
-              <w:rPr>
-                <w:rFonts w:ascii="Arial" w:hAnsi="Arial"/>
-                <w:b w:val="0"/>
-                <w:i w:val="0"/>
-                <w:color w:val="000000"/>
-                <w:sz w:val="19"/>
-              </w:rPr>
-              <w:t xml:space="preserve">dokumen </w:t>
-            </w:r>
-            <w:r>
-              <w:rPr>
-                <w:rFonts w:ascii="Arial" w:hAnsi="Arial"/>
-                <w:b w:val="0"/>
-                <w:i w:val="0"/>
-                <w:color w:val="000000"/>
-                <w:sz w:val="19"/>
-              </w:rPr>
-              <w:t xml:space="preserve">diarahkan </w:t>
-            </w:r>
-            <w:r>
-              <w:rPr>
-                <w:rFonts w:ascii="Arial" w:hAnsi="Arial"/>
-                <w:b w:val="0"/>
-                <w:i w:val="0"/>
-                <w:color w:val="000000"/>
-                <w:sz w:val="19"/>
-              </w:rPr>
-              <w:t xml:space="preserve">ke </w:t>
-            </w:r>
-            <w:r>
-              <w:rPr>
-                <w:rFonts w:ascii="Arial" w:hAnsi="Arial"/>
-                <w:b w:val="0"/>
-                <w:i w:val="0"/>
-                <w:color w:val="000000"/>
-                <w:sz w:val="19"/>
-              </w:rPr>
-              <w:t xml:space="preserve">Gemini </w:t>
-            </w:r>
-            <w:r>
-              <w:rPr>
-                <w:rFonts w:ascii="Arial" w:hAnsi="Arial"/>
-                <w:b w:val="0"/>
-                <w:i w:val="0"/>
-                <w:color w:val="000000"/>
-                <w:sz w:val="19"/>
-              </w:rPr>
-              <w:t xml:space="preserve">3.5 </w:t>
-            </w:r>
-            <w:r>
-              <w:rPr>
-                <w:rFonts w:ascii="Arial" w:hAnsi="Arial"/>
-                <w:b w:val="0"/>
-                <w:i/>
-                <w:color w:val="000000"/>
-                <w:sz w:val="19"/>
-              </w:rPr>
-              <w:t>Flash).</w:t>
-              <w:br/>
-              <w:t xml:space="preserve">3. </w:t>
-            </w:r>
-            <w:r>
-              <w:rPr>
-                <w:rFonts w:ascii="Arial" w:hAnsi="Arial"/>
-                <w:b w:val="0"/>
-                <w:i w:val="0"/>
-                <w:color w:val="000000"/>
-                <w:sz w:val="19"/>
-              </w:rPr>
-              <w:t xml:space="preserve">Kirimkan </w:t>
-            </w:r>
-            <w:r>
-              <w:rPr>
-                <w:rFonts w:ascii="Arial" w:hAnsi="Arial"/>
-                <w:b w:val="0"/>
-                <w:i w:val="0"/>
-                <w:color w:val="000000"/>
-                <w:sz w:val="19"/>
-              </w:rPr>
-              <w:t xml:space="preserve">transkripsi </w:t>
-            </w:r>
-            <w:r>
-              <w:rPr>
-                <w:rFonts w:ascii="Arial" w:hAnsi="Arial"/>
-                <w:b w:val="0"/>
-                <w:i w:val="0"/>
-                <w:color w:val="000000"/>
-                <w:sz w:val="19"/>
-              </w:rPr>
-              <w:t xml:space="preserve">suara </w:t>
-            </w:r>
-            <w:r>
-              <w:rPr>
-                <w:rFonts w:ascii="Arial" w:hAnsi="Arial"/>
-                <w:b w:val="0"/>
-                <w:i w:val="0"/>
-                <w:color w:val="000000"/>
-                <w:sz w:val="19"/>
-              </w:rPr>
-              <w:t xml:space="preserve">M4A </w:t>
-            </w:r>
-            <w:r>
-              <w:rPr>
-                <w:rFonts w:ascii="Arial" w:hAnsi="Arial"/>
-                <w:b w:val="0"/>
-                <w:i w:val="0"/>
-                <w:color w:val="000000"/>
-                <w:sz w:val="19"/>
-              </w:rPr>
-              <w:t xml:space="preserve">via </w:t>
-            </w:r>
-            <w:r>
-              <w:rPr>
-                <w:rFonts w:ascii="Arial" w:hAnsi="Arial"/>
-                <w:b w:val="0"/>
-                <w:i/>
-                <w:color w:val="000000"/>
-                <w:sz w:val="19"/>
-              </w:rPr>
-              <w:t xml:space="preserve">Whisper-1 </w:t>
-            </w:r>
-            <w:r>
-              <w:rPr>
-                <w:rFonts w:ascii="Arial" w:hAnsi="Arial"/>
-                <w:b w:val="0"/>
-                <w:i w:val="0"/>
-                <w:color w:val="000000"/>
-                <w:sz w:val="19"/>
-              </w:rPr>
-              <w:t xml:space="preserve">dan </w:t>
-            </w:r>
-            <w:r>
-              <w:rPr>
-                <w:rFonts w:ascii="Arial" w:hAnsi="Arial"/>
-                <w:b w:val="0"/>
-                <w:i/>
-                <w:color w:val="000000"/>
-                <w:sz w:val="19"/>
-              </w:rPr>
-              <w:t xml:space="preserve">streaming </w:t>
-            </w:r>
-            <w:r>
-              <w:rPr>
-                <w:rFonts w:ascii="Arial" w:hAnsi="Arial"/>
-                <w:b w:val="0"/>
-                <w:i w:val="0"/>
-                <w:color w:val="000000"/>
-                <w:sz w:val="19"/>
-              </w:rPr>
-              <w:t xml:space="preserve">SSE. </w:t>
-            </w:r>
-          </w:p>
-        </w:tc>
-        <w:tc>
-          <w:tcPr>
-            <w:tcW w:type="dxa" w:w="3402"/>
-            <w:tcMar>
-              <w:top w:w="100" w:type="dxa"/>
-              <w:bottom w:w="100" w:type="dxa"/>
-              <w:left w:w="120" w:type="dxa"/>
-              <w:right w:w="120" w:type="dxa"/>
-            </w:tcMar>
-            <w:tcBorders>
-              <w:top w:val="single" w:sz="4" w:space="0" w:color="CCCCCC"/>
-              <w:bottom w:val="single" w:sz="4" w:space="0" w:color="CCCCCC"/>
-              <w:left w:val="single" w:sz="4" w:space="0" w:color="CCCCCC"/>
-              <w:right w:val="single" w:sz="4" w:space="0" w:color="CCCCCC"/>
-            </w:tcBorders>
-            <w:vAlign w:val="center"/>
-          </w:tcPr>
-          <w:p>
-            <w:pPr>
-              <w:spacing w:before="0" w:after="0" w:line="252" w:lineRule="auto"/>
-              <w:jc w:val="left"/>
-            </w:pPr>
-            <w:r/>
-            <w:r>
-              <w:rPr>
-                <w:rFonts w:ascii="Arial" w:hAnsi="Arial"/>
-                <w:b w:val="0"/>
-                <w:i w:val="0"/>
-                <w:color w:val="000000"/>
-                <w:sz w:val="19"/>
-              </w:rPr>
-              <w:t xml:space="preserve">Sistem </w:t>
-            </w:r>
-            <w:r>
-              <w:rPr>
-                <w:rFonts w:ascii="Arial" w:hAnsi="Arial"/>
-                <w:b w:val="0"/>
-                <w:i w:val="0"/>
-                <w:color w:val="000000"/>
-                <w:sz w:val="19"/>
-              </w:rPr>
-              <w:t xml:space="preserve">merespons </w:t>
-            </w:r>
-            <w:r>
-              <w:rPr>
-                <w:rFonts w:ascii="Arial" w:hAnsi="Arial"/>
-                <w:b w:val="0"/>
-                <w:i w:val="0"/>
-                <w:color w:val="000000"/>
-                <w:sz w:val="19"/>
-              </w:rPr>
-              <w:t xml:space="preserve">kueri </w:t>
-            </w:r>
-            <w:r>
-              <w:rPr>
-                <w:rFonts w:ascii="Arial" w:hAnsi="Arial"/>
-                <w:b w:val="0"/>
-                <w:i w:val="0"/>
-                <w:color w:val="000000"/>
-                <w:sz w:val="19"/>
-              </w:rPr>
-              <w:t xml:space="preserve">sapaan </w:t>
-            </w:r>
-            <w:r>
-              <w:rPr>
-                <w:rFonts w:ascii="Arial" w:hAnsi="Arial"/>
-                <w:b w:val="0"/>
-                <w:i w:val="0"/>
-                <w:color w:val="000000"/>
-                <w:sz w:val="19"/>
-              </w:rPr>
-              <w:t xml:space="preserve">singkat </w:t>
-            </w:r>
-            <w:r>
-              <w:rPr>
-                <w:rFonts w:ascii="Arial" w:hAnsi="Arial"/>
-                <w:b w:val="0"/>
-                <w:i w:val="0"/>
-                <w:color w:val="000000"/>
-                <w:sz w:val="19"/>
-              </w:rPr>
-              <w:t xml:space="preserve">secara </w:t>
-            </w:r>
-            <w:r>
-              <w:rPr>
-                <w:rFonts w:ascii="Arial" w:hAnsi="Arial"/>
-                <w:b w:val="0"/>
-                <w:i w:val="0"/>
-                <w:color w:val="000000"/>
-                <w:sz w:val="19"/>
-              </w:rPr>
-              <w:t xml:space="preserve">instan </w:t>
-            </w:r>
-            <w:r>
-              <w:rPr>
-                <w:rFonts w:ascii="Arial" w:hAnsi="Arial"/>
-                <w:b w:val="0"/>
-                <w:i w:val="0"/>
-                <w:color w:val="000000"/>
-                <w:sz w:val="19"/>
-              </w:rPr>
-              <w:t xml:space="preserve">(&lt;500ms). </w:t>
-            </w:r>
-            <w:r>
-              <w:rPr>
-                <w:rFonts w:ascii="Arial" w:hAnsi="Arial"/>
-                <w:b w:val="0"/>
-                <w:i w:val="0"/>
-                <w:color w:val="000000"/>
-                <w:sz w:val="19"/>
-              </w:rPr>
-              <w:t xml:space="preserve">Kueri </w:t>
-            </w:r>
-            <w:r>
-              <w:rPr>
-                <w:rFonts w:ascii="Arial" w:hAnsi="Arial"/>
-                <w:b w:val="0"/>
-                <w:i w:val="0"/>
-                <w:color w:val="000000"/>
-                <w:sz w:val="19"/>
-              </w:rPr>
-              <w:t xml:space="preserve">regulasi </w:t>
-            </w:r>
-            <w:r>
-              <w:rPr>
-                <w:rFonts w:ascii="Arial" w:hAnsi="Arial"/>
-                <w:b w:val="0"/>
-                <w:i w:val="0"/>
-                <w:color w:val="000000"/>
-                <w:sz w:val="19"/>
-              </w:rPr>
-              <w:t xml:space="preserve">menampilkan </w:t>
-            </w:r>
-            <w:r>
-              <w:rPr>
-                <w:rFonts w:ascii="Arial" w:hAnsi="Arial"/>
-                <w:b w:val="0"/>
-                <w:i w:val="0"/>
-                <w:color w:val="000000"/>
-                <w:sz w:val="19"/>
-              </w:rPr>
-              <w:t xml:space="preserve">kutipan </w:t>
-            </w:r>
-            <w:r>
-              <w:rPr>
-                <w:rFonts w:ascii="Arial" w:hAnsi="Arial"/>
-                <w:b w:val="0"/>
-                <w:i w:val="0"/>
-                <w:color w:val="000000"/>
-                <w:sz w:val="19"/>
-              </w:rPr>
-              <w:t xml:space="preserve">pasal </w:t>
-            </w:r>
-            <w:r>
-              <w:rPr>
-                <w:rFonts w:ascii="Arial" w:hAnsi="Arial"/>
-                <w:b w:val="0"/>
-                <w:i w:val="0"/>
-                <w:color w:val="000000"/>
-                <w:sz w:val="19"/>
-              </w:rPr>
-              <w:t xml:space="preserve">hukum </w:t>
-            </w:r>
-            <w:r>
-              <w:rPr>
-                <w:rFonts w:ascii="Arial" w:hAnsi="Arial"/>
-                <w:b w:val="0"/>
-                <w:i w:val="0"/>
-                <w:color w:val="000000"/>
-                <w:sz w:val="19"/>
-              </w:rPr>
-              <w:t xml:space="preserve">resmi </w:t>
-            </w:r>
-            <w:r>
-              <w:rPr>
-                <w:rFonts w:ascii="Arial" w:hAnsi="Arial"/>
-                <w:b w:val="0"/>
-                <w:i w:val="0"/>
-                <w:color w:val="000000"/>
-                <w:sz w:val="19"/>
-              </w:rPr>
-              <w:t xml:space="preserve">secara </w:t>
-            </w:r>
-            <w:r>
-              <w:rPr>
-                <w:rFonts w:ascii="Arial" w:hAnsi="Arial"/>
-                <w:b w:val="0"/>
-                <w:i/>
-                <w:color w:val="000000"/>
-                <w:sz w:val="19"/>
-              </w:rPr>
-              <w:t xml:space="preserve">streaming. </w:t>
-            </w:r>
-          </w:p>
-        </w:tc>
-      </w:tr>
-    </w:tbl>
     <w:p>
       <w:pPr>
-        <w:spacing w:before="60" w:after="120" w:line="240" w:lineRule="auto"/>
-        <w:jc w:val="center"/>
+        <w:keepNext/>
+        <w:spacing w:before="240" w:after="80" w:line="276" w:lineRule="auto"/>
+        <w:jc w:val="left"/>
       </w:pPr>
       <w:r>
         <w:rPr>
           <w:rFonts w:ascii="Arial" w:hAnsi="Arial"/>
-          <w:i/>
-          <w:color w:val="555555"/>
-          <w:sz w:val="18"/>
+          <w:b/>
+          <w:color w:val="000000"/>
+          <w:sz w:val="24"/>
         </w:rPr>
-        <w:t>Tabel 1. Panduan instruksi kerja teknis dan kriteria keberhasilan bagi kompetitor LKS.</w:t>
+        <w:t>Modul A: Client Mobile &amp; Inti Gamifikasi</w:t>
+      </w:r>
+    </w:p>
+    <w:p>
+      <w:pPr>
+        <w:spacing w:before="0" w:after="120" w:line="276" w:lineRule="auto"/>
+        <w:jc w:val="both"/>
+      </w:pPr>
+      <w:r>
+        <w:rPr>
+          <w:rFonts w:ascii="Arial" w:hAnsi="Arial"/>
+          <w:b w:val="0"/>
+          <w:i w:val="0"/>
+          <w:color w:val="000000"/>
+          <w:sz w:val="21"/>
+        </w:rPr>
+        <w:t>Peserta wajib membangun aplikasi mobile warga menggunakan Flutter dengan arsitektur bersih dan manajemen status BLoC. Modul ini berfokus pada implementasi antarmuka pengguna (UI/UX), penangkapan koordinat GPS otomatis via geolocator saat memotret, serta visualisasi poin pengalaman (XP), level warga, lencana pencapaian (badges), dan papan peringkat (leaderboard) secara real-time.</w:t>
+      </w:r>
+    </w:p>
+    <w:p>
+      <w:pPr>
+        <w:keepNext/>
+        <w:spacing w:before="240" w:after="80" w:line="276" w:lineRule="auto"/>
+        <w:jc w:val="left"/>
+      </w:pPr>
+      <w:r>
+        <w:rPr>
+          <w:rFonts w:ascii="Arial" w:hAnsi="Arial"/>
+          <w:b/>
+          <w:color w:val="000000"/>
+          <w:sz w:val="24"/>
+        </w:rPr>
+        <w:t>Modul B: API Aman &amp; Lapisan Akses Relasional</w:t>
+      </w:r>
+    </w:p>
+    <w:p>
+      <w:pPr>
+        <w:spacing w:before="0" w:after="120" w:line="276" w:lineRule="auto"/>
+        <w:jc w:val="both"/>
+      </w:pPr>
+      <w:r>
+        <w:rPr>
+          <w:rFonts w:ascii="Arial" w:hAnsi="Arial"/>
+          <w:b w:val="0"/>
+          <w:i w:val="0"/>
+          <w:color w:val="000000"/>
+          <w:sz w:val="21"/>
+        </w:rPr>
+        <w:t>Peserta wajib membangun endpoint REST API menggunakan NestJS Fastify dan database relasional. Modul ini mencakup sistem autentikasi berbasis token JWT, otorisasi berbasis peran (RBAC) untuk menu warga (citizen) dan pengelola (admin), serta struktur tabel relasional PostgreSQL di Supabase.</w:t>
+      </w:r>
+    </w:p>
+    <w:p>
+      <w:pPr>
+        <w:keepNext/>
+        <w:spacing w:before="240" w:after="80" w:line="276" w:lineRule="auto"/>
+        <w:jc w:val="left"/>
+      </w:pPr>
+      <w:r>
+        <w:rPr>
+          <w:rFonts w:ascii="Arial" w:hAnsi="Arial"/>
+          <w:b/>
+          <w:color w:val="000000"/>
+          <w:sz w:val="24"/>
+        </w:rPr>
+        <w:t>Modul C: Pemrosesan Spasial &amp; Sanitasi Computer Vision</w:t>
+      </w:r>
+    </w:p>
+    <w:p>
+      <w:pPr>
+        <w:spacing w:before="0" w:after="120" w:line="276" w:lineRule="auto"/>
+        <w:jc w:val="both"/>
+      </w:pPr>
+      <w:r>
+        <w:rPr>
+          <w:rFonts w:ascii="Arial" w:hAnsi="Arial"/>
+          <w:b w:val="0"/>
+          <w:i w:val="0"/>
+          <w:color w:val="000000"/>
+          <w:sz w:val="21"/>
+        </w:rPr>
+        <w:t>Peserta wajib mengonfigurasi algoritma spasial dan otomatisasi sanitasi gambar. Modul ini membutuhkan fungsi database PostGIS check_duplicate_report() untuk mendeteksi laporan aktif dalam radius 50 meter dan jendela waktu 12 jam agar laporan baru otomatis digabungkan sebagai upvote. Selain itu, peserta wajib menggunakan model computer vision untuk mendeteksi wajah dan plat nomor kendaraan secara otomatis, lalu memburamkannya secara in-memory menggunakan Sharp sebelum diunggah ke Google Cloud Storage (GCS).</w:t>
+      </w:r>
+    </w:p>
+    <w:p>
+      <w:pPr>
+        <w:keepNext/>
+        <w:spacing w:before="240" w:after="80" w:line="276" w:lineRule="auto"/>
+        <w:jc w:val="left"/>
+      </w:pPr>
+      <w:r>
+        <w:rPr>
+          <w:rFonts w:ascii="Arial" w:hAnsi="Arial"/>
+          <w:b/>
+          <w:color w:val="000000"/>
+          <w:sz w:val="24"/>
+        </w:rPr>
+        <w:t>Modul D: Retrieval-Augmented Generation (RAG) &amp; Perutean Model AI Dinamis</w:t>
+      </w:r>
+    </w:p>
+    <w:p>
+      <w:pPr>
+        <w:spacing w:before="0" w:after="120" w:line="276" w:lineRule="auto"/>
+        <w:jc w:val="both"/>
+      </w:pPr>
+      <w:r>
+        <w:rPr>
+          <w:rFonts w:ascii="Arial" w:hAnsi="Arial"/>
+          <w:b w:val="0"/>
+          <w:i w:val="0"/>
+          <w:color w:val="000000"/>
+          <w:sz w:val="21"/>
+        </w:rPr>
+        <w:t>Peserta wajib mengimplementasikan sistem pencarian semantik dan perutean model AI dinamis. Modul ini mencakup pencarian kesamaan kosinus pada database vektor pgvector (indeks HNSW), transkripsi audio chatbot menggunakan Whisper-1, pembuatan API Router untuk membagi kueri pendek ke Gemini 2.5 Flash Lite dan kueri panjang/RAG ke Gemini 3.5 Flash, serta pengiriman data streaming via SSE.</w:t>
+      </w:r>
+    </w:p>
+    <w:p>
+      <w:pPr>
+        <w:keepNext/>
+        <w:spacing w:before="240" w:after="80" w:line="276" w:lineRule="auto"/>
+        <w:jc w:val="left"/>
+      </w:pPr>
+      <w:r>
+        <w:rPr>
+          <w:rFonts w:ascii="Arial" w:hAnsi="Arial"/>
+          <w:b/>
+          <w:color w:val="000000"/>
+          <w:sz w:val="24"/>
+        </w:rPr>
+        <w:t>Target Capaian Pembelajaran (Expected Learning Outcomes)</w:t>
+      </w:r>
+    </w:p>
+    <w:p>
+      <w:pPr>
+        <w:spacing w:before="0" w:after="120" w:line="276" w:lineRule="auto"/>
+        <w:jc w:val="both"/>
+      </w:pPr>
+      <w:r>
+        <w:rPr>
+          <w:rFonts w:ascii="Arial" w:hAnsi="Arial"/>
+          <w:b w:val="0"/>
+          <w:i w:val="0"/>
+          <w:color w:val="000000"/>
+          <w:sz w:val="21"/>
+        </w:rPr>
+        <w:t>Dengan menyelesaikan proyek uji ini, peserta membuktikan penguasaan dalam domain teknis berikut:</w:t>
+        <w:br/>
+        <w:t>1. Integrasi AI: Penerapan praktis model LLM, embedding, dan pengolahan computer vision.</w:t>
+        <w:br/>
+        <w:t>2. Computer Vision: Proteksi privasi data warga via sensor otomatis wajah dan plat nomor kendaraan.</w:t>
+        <w:br/>
+        <w:t>3. Pemrosesan Geospasial: Deduplikasi spasial berbasis radius dan rentang waktu.</w:t>
+        <w:br/>
+        <w:t>4. Information Retrieval: Pencarian semantik berbasis vektor dan RAG regulasi hukum.</w:t>
+        <w:br/>
+        <w:t>5. Full-Stack Engineering: Desain API backend yang aman, database relasional, dan aplikasi mobile multiplatform.</w:t>
+        <w:br/>
+        <w:t>6. Responsible AI: Penerapan pengolahan data aman, pembatasan prompt injection, dan batas verifikasi manual manusia (HITL).</w:t>
       </w:r>
     </w:p>
     <w:p>
@@ -3188,7 +493,7 @@
           <w:color w:val="0A2240"/>
           <w:sz w:val="28"/>
         </w:rPr>
-        <w:t>Other</w:t>
+        <w:t>Instruksi kepada Peserta</w:t>
       </w:r>
     </w:p>
     <w:p>
@@ -3204,7 +509,420 @@
           <w:color w:val="000000"/>
           <w:sz w:val="24"/>
         </w:rPr>
-        <w:t>1. Penerapan Responsible AI dan Mitigasi Risiko</w:t>
+        <w:t>Modul A: Client Mobile &amp; Inti Gamifikasi</w:t>
+      </w:r>
+    </w:p>
+    <w:p>
+      <w:pPr>
+        <w:spacing w:before="0" w:after="120" w:line="276" w:lineRule="auto"/>
+        <w:jc w:val="both"/>
+      </w:pPr>
+      <w:r>
+        <w:rPr>
+          <w:rFonts w:ascii="Arial" w:hAnsi="Arial"/>
+          <w:b/>
+          <w:i w:val="0"/>
+          <w:color w:val="000000"/>
+          <w:sz w:val="21"/>
+        </w:rPr>
+        <w:t>Tujuan: Mengimplementasikan aplikasi mobile warga untuk pelaporan dan umpan balik gamifikasi.</w:t>
+        <w:br/>
+      </w:r>
+      <w:r>
+        <w:rPr>
+          <w:rFonts w:ascii="Arial" w:hAnsi="Arial"/>
+          <w:b/>
+          <w:i w:val="0"/>
+          <w:color w:val="000000"/>
+          <w:sz w:val="21"/>
+        </w:rPr>
+        <w:t>Persyaratan:</w:t>
+        <w:br/>
+      </w:r>
+      <w:r>
+        <w:rPr>
+          <w:rFonts w:ascii="Arial" w:hAnsi="Arial"/>
+          <w:b w:val="0"/>
+          <w:i w:val="0"/>
+          <w:color w:val="000000"/>
+          <w:sz w:val="21"/>
+        </w:rPr>
+        <w:t>- Peserta wajib membuat halaman pelaporan sampah yang mengakses kamera dan geolocator perangkat.</w:t>
+        <w:br/>
+        <w:t>- Peserta wajib menggunakan pola BLoC untuk mengelola status perolehan poin XP, level warga, dan lencana.</w:t>
+        <w:br/>
+      </w:r>
+      <w:r>
+        <w:rPr>
+          <w:rFonts w:ascii="Arial" w:hAnsi="Arial"/>
+          <w:b/>
+          <w:i w:val="0"/>
+          <w:color w:val="000000"/>
+          <w:sz w:val="21"/>
+        </w:rPr>
+        <w:t xml:space="preserve">Hasil yang Diharapkan: </w:t>
+      </w:r>
+      <w:r>
+        <w:rPr>
+          <w:rFonts w:ascii="Arial" w:hAnsi="Arial"/>
+          <w:b w:val="0"/>
+          <w:i w:val="0"/>
+          <w:color w:val="000000"/>
+          <w:sz w:val="21"/>
+        </w:rPr>
+        <w:t>UI aplikasi mobile fungsional yang menampilkan metadata lokasi laporan dan data poin gamifikasi.</w:t>
+        <w:br/>
+      </w:r>
+      <w:r>
+        <w:rPr>
+          <w:rFonts w:ascii="Arial" w:hAnsi="Arial"/>
+          <w:b/>
+          <w:i w:val="0"/>
+          <w:color w:val="000000"/>
+          <w:sz w:val="21"/>
+        </w:rPr>
+        <w:t xml:space="preserve">Batasan: </w:t>
+      </w:r>
+      <w:r>
+        <w:rPr>
+          <w:rFonts w:ascii="Arial" w:hAnsi="Arial"/>
+          <w:b w:val="0"/>
+          <w:i w:val="0"/>
+          <w:color w:val="000000"/>
+          <w:sz w:val="21"/>
+        </w:rPr>
+        <w:t>Aplikasi harus membaca koordinat lokasi secara otomatis tanpa memerlukan input teks manual dari warga.</w:t>
+      </w:r>
+    </w:p>
+    <w:p>
+      <w:pPr>
+        <w:keepNext/>
+        <w:spacing w:before="240" w:after="80" w:line="276" w:lineRule="auto"/>
+        <w:jc w:val="left"/>
+      </w:pPr>
+      <w:r>
+        <w:rPr>
+          <w:rFonts w:ascii="Arial" w:hAnsi="Arial"/>
+          <w:b/>
+          <w:color w:val="000000"/>
+          <w:sz w:val="24"/>
+        </w:rPr>
+        <w:t>Modul B: API Aman &amp; Lapisan Akses Relasional</w:t>
+      </w:r>
+    </w:p>
+    <w:p>
+      <w:pPr>
+        <w:spacing w:before="0" w:after="120" w:line="276" w:lineRule="auto"/>
+        <w:jc w:val="both"/>
+      </w:pPr>
+      <w:r>
+        <w:rPr>
+          <w:rFonts w:ascii="Arial" w:hAnsi="Arial"/>
+          <w:b/>
+          <w:i w:val="0"/>
+          <w:color w:val="000000"/>
+          <w:sz w:val="21"/>
+        </w:rPr>
+        <w:t>Tujuan: Membangun endpoint REST API yang aman dan skema database relasional.</w:t>
+        <w:br/>
+      </w:r>
+      <w:r>
+        <w:rPr>
+          <w:rFonts w:ascii="Arial" w:hAnsi="Arial"/>
+          <w:b/>
+          <w:i w:val="0"/>
+          <w:color w:val="000000"/>
+          <w:sz w:val="21"/>
+        </w:rPr>
+        <w:t>Persyaratan:</w:t>
+        <w:br/>
+      </w:r>
+      <w:r>
+        <w:rPr>
+          <w:rFonts w:ascii="Arial" w:hAnsi="Arial"/>
+          <w:b w:val="0"/>
+          <w:i w:val="0"/>
+          <w:color w:val="000000"/>
+          <w:sz w:val="21"/>
+        </w:rPr>
+        <w:t>- Peserta wajib mengimplementasikan API controller yang dilindungi autentikasi JWT token.</w:t>
+        <w:br/>
+        <w:t>- Peserta wajib menerapkan sistem otorisasi peran (RBAC) untuk mengamankan menu admin dari akses warga.</w:t>
+        <w:br/>
+      </w:r>
+      <w:r>
+        <w:rPr>
+          <w:rFonts w:ascii="Arial" w:hAnsi="Arial"/>
+          <w:b/>
+          <w:i w:val="0"/>
+          <w:color w:val="000000"/>
+          <w:sz w:val="21"/>
+        </w:rPr>
+        <w:t xml:space="preserve">Hasil yang Diharapkan: </w:t>
+      </w:r>
+      <w:r>
+        <w:rPr>
+          <w:rFonts w:ascii="Arial" w:hAnsi="Arial"/>
+          <w:b w:val="0"/>
+          <w:i w:val="0"/>
+          <w:color w:val="000000"/>
+          <w:sz w:val="21"/>
+        </w:rPr>
+        <w:t>Endpoint API yang terdokumentasi di Swagger dan terhubung ke database relasional.</w:t>
+        <w:br/>
+      </w:r>
+      <w:r>
+        <w:rPr>
+          <w:rFonts w:ascii="Arial" w:hAnsi="Arial"/>
+          <w:b/>
+          <w:i w:val="0"/>
+          <w:color w:val="000000"/>
+          <w:sz w:val="21"/>
+        </w:rPr>
+        <w:t xml:space="preserve">Batasan: </w:t>
+      </w:r>
+      <w:r>
+        <w:rPr>
+          <w:rFonts w:ascii="Arial" w:hAnsi="Arial"/>
+          <w:b w:val="0"/>
+          <w:i w:val="0"/>
+          <w:color w:val="000000"/>
+          <w:sz w:val="21"/>
+        </w:rPr>
+        <w:t>Seluruh akses pelaporan harus terautentikasi. Permintaan anonim wajib ditolak sistem.</w:t>
+      </w:r>
+    </w:p>
+    <w:p>
+      <w:pPr>
+        <w:keepNext/>
+        <w:spacing w:before="240" w:after="80" w:line="276" w:lineRule="auto"/>
+        <w:jc w:val="left"/>
+      </w:pPr>
+      <w:r>
+        <w:rPr>
+          <w:rFonts w:ascii="Arial" w:hAnsi="Arial"/>
+          <w:b/>
+          <w:color w:val="000000"/>
+          <w:sz w:val="24"/>
+        </w:rPr>
+        <w:t>Modul C: Pemrosesan Spasial &amp; Sanitasi Computer Vision</w:t>
+      </w:r>
+    </w:p>
+    <w:p>
+      <w:pPr>
+        <w:spacing w:before="0" w:after="120" w:line="276" w:lineRule="auto"/>
+        <w:jc w:val="both"/>
+      </w:pPr>
+      <w:r>
+        <w:rPr>
+          <w:rFonts w:ascii="Arial" w:hAnsi="Arial"/>
+          <w:b/>
+          <w:i w:val="0"/>
+          <w:color w:val="000000"/>
+          <w:sz w:val="21"/>
+        </w:rPr>
+        <w:t>Tujuan: Mengimplementasikan pencegahan laporan spam spasial dan sensor data sensitif otomatis.</w:t>
+        <w:br/>
+      </w:r>
+      <w:r>
+        <w:rPr>
+          <w:rFonts w:ascii="Arial" w:hAnsi="Arial"/>
+          <w:b/>
+          <w:i w:val="0"/>
+          <w:color w:val="000000"/>
+          <w:sz w:val="21"/>
+        </w:rPr>
+        <w:t>Persyaratan:</w:t>
+        <w:br/>
+      </w:r>
+      <w:r>
+        <w:rPr>
+          <w:rFonts w:ascii="Arial" w:hAnsi="Arial"/>
+          <w:b w:val="0"/>
+          <w:i w:val="0"/>
+          <w:color w:val="000000"/>
+          <w:sz w:val="21"/>
+        </w:rPr>
+        <w:t>- Peserta wajib membuat fungsi spasial SQL menggunakan ST_DWithin untuk mencari duplikasi dalam radius 50m.</w:t>
+        <w:br/>
+        <w:t>- Peserta wajib mengintegrasikan model computer vision untuk mendeteksi koordinat wajah/plat nomor, dan menerapkan filter Gaussian blur via Sharp.</w:t>
+        <w:br/>
+      </w:r>
+      <w:r>
+        <w:rPr>
+          <w:rFonts w:ascii="Arial" w:hAnsi="Arial"/>
+          <w:b/>
+          <w:i w:val="0"/>
+          <w:color w:val="000000"/>
+          <w:sz w:val="21"/>
+        </w:rPr>
+        <w:t xml:space="preserve">Hasil yang Diharapkan: </w:t>
+      </w:r>
+      <w:r>
+        <w:rPr>
+          <w:rFonts w:ascii="Arial" w:hAnsi="Arial"/>
+          <w:b w:val="0"/>
+          <w:i w:val="0"/>
+          <w:color w:val="000000"/>
+          <w:sz w:val="21"/>
+        </w:rPr>
+        <w:t>Foto yang tersimpan di cloud storage terbukti tersensor, dan laporan dalam radius 50m tergabung otomatis.</w:t>
+        <w:br/>
+      </w:r>
+      <w:r>
+        <w:rPr>
+          <w:rFonts w:ascii="Arial" w:hAnsi="Arial"/>
+          <w:b/>
+          <w:i w:val="0"/>
+          <w:color w:val="000000"/>
+          <w:sz w:val="21"/>
+        </w:rPr>
+        <w:t xml:space="preserve">Batasan: </w:t>
+      </w:r>
+      <w:r>
+        <w:rPr>
+          <w:rFonts w:ascii="Arial" w:hAnsi="Arial"/>
+          <w:b w:val="0"/>
+          <w:i w:val="0"/>
+          <w:color w:val="000000"/>
+          <w:sz w:val="21"/>
+        </w:rPr>
+        <w:t>Proses pemotongan/sensor gambar wajib dikerjakan in-memory di RAM server. Menyimpan gambar mentah tanpa blur adalah pelanggaran keamanan.</w:t>
+      </w:r>
+    </w:p>
+    <w:p>
+      <w:pPr>
+        <w:keepNext/>
+        <w:spacing w:before="240" w:after="80" w:line="276" w:lineRule="auto"/>
+        <w:jc w:val="left"/>
+      </w:pPr>
+      <w:r>
+        <w:rPr>
+          <w:rFonts w:ascii="Arial" w:hAnsi="Arial"/>
+          <w:b/>
+          <w:color w:val="000000"/>
+          <w:sz w:val="24"/>
+        </w:rPr>
+        <w:t>Modul D: Retrieval-Augmented Generation (RAG) &amp; Perutean Model AI Dinamis</w:t>
+      </w:r>
+    </w:p>
+    <w:p>
+      <w:pPr>
+        <w:spacing w:before="0" w:after="120" w:line="276" w:lineRule="auto"/>
+        <w:jc w:val="both"/>
+      </w:pPr>
+      <w:r>
+        <w:rPr>
+          <w:rFonts w:ascii="Arial" w:hAnsi="Arial"/>
+          <w:b/>
+          <w:i w:val="0"/>
+          <w:color w:val="000000"/>
+          <w:sz w:val="21"/>
+        </w:rPr>
+        <w:t>Tujuan: Membangun asisten chatbot regulasi hukum berbasis RAG dengan perutean model AI dinamis.</w:t>
+        <w:br/>
+      </w:r>
+      <w:r>
+        <w:rPr>
+          <w:rFonts w:ascii="Arial" w:hAnsi="Arial"/>
+          <w:b/>
+          <w:i w:val="0"/>
+          <w:color w:val="000000"/>
+          <w:sz w:val="21"/>
+        </w:rPr>
+        <w:t>Persyaratan:</w:t>
+        <w:br/>
+      </w:r>
+      <w:r>
+        <w:rPr>
+          <w:rFonts w:ascii="Arial" w:hAnsi="Arial"/>
+          <w:b w:val="0"/>
+          <w:i w:val="0"/>
+          <w:color w:val="000000"/>
+          <w:sz w:val="21"/>
+        </w:rPr>
+        <w:t>- Peserta wajib menerapkan pencarian semantik menggunakan kesamaan kosinus pada database vektor.</w:t>
+        <w:br/>
+        <w:t>- Peserta wajib merancang mekanisme API Router: mengarahkan kueri percakapan pendek (&lt; 100 karakter) ke model Gemini 2.5 Flash Lite, dan kueri analisis dokumen/RAG panjang ke model Gemini 3.5 Flash.</w:t>
+        <w:br/>
+      </w:r>
+      <w:r>
+        <w:rPr>
+          <w:rFonts w:ascii="Arial" w:hAnsi="Arial"/>
+          <w:b/>
+          <w:i w:val="0"/>
+          <w:color w:val="000000"/>
+          <w:sz w:val="21"/>
+        </w:rPr>
+        <w:t xml:space="preserve">Hasil yang Diharapkan: </w:t>
+      </w:r>
+      <w:r>
+        <w:rPr>
+          <w:rFonts w:ascii="Arial" w:hAnsi="Arial"/>
+          <w:b w:val="0"/>
+          <w:i w:val="0"/>
+          <w:color w:val="000000"/>
+          <w:sz w:val="21"/>
+        </w:rPr>
+        <w:t>Chatbot regulasi lingkungan hidup yang merespons secara streaming menggunakan Server-Sent Events (SSE).</w:t>
+        <w:br/>
+      </w:r>
+      <w:r>
+        <w:rPr>
+          <w:rFonts w:ascii="Arial" w:hAnsi="Arial"/>
+          <w:b/>
+          <w:i w:val="0"/>
+          <w:color w:val="000000"/>
+          <w:sz w:val="21"/>
+        </w:rPr>
+        <w:t xml:space="preserve">Batasan: </w:t>
+      </w:r>
+      <w:r>
+        <w:rPr>
+          <w:rFonts w:ascii="Arial" w:hAnsi="Arial"/>
+          <w:b w:val="0"/>
+          <w:i w:val="0"/>
+          <w:color w:val="000000"/>
+          <w:sz w:val="21"/>
+        </w:rPr>
+        <w:t>Respons chatbot wajib bersumber secara mutlak pada dokumen regulasi resmi yang tersimpan di database vektor.</w:t>
+      </w:r>
+    </w:p>
+    <w:p>
+      <w:r>
+        <w:br w:type="page"/>
+      </w:r>
+    </w:p>
+    <w:p>
+      <w:pPr>
+        <w:keepNext/>
+        <w:spacing w:before="360" w:after="120" w:line="276" w:lineRule="auto"/>
+        <w:jc w:val="left"/>
+      </w:pPr>
+      <w:r>
+        <w:rPr>
+          <w:rFonts w:ascii="Arial" w:hAnsi="Arial"/>
+          <w:b/>
+          <w:color w:val="0A2240"/>
+          <w:sz w:val="28"/>
+        </w:rPr>
+        <w:t>Lain-lain</w:t>
+      </w:r>
+    </w:p>
+    <w:p>
+      <w:pPr>
+        <w:keepNext/>
+        <w:spacing w:before="240" w:after="80" w:line="276" w:lineRule="auto"/>
+        <w:jc w:val="left"/>
+      </w:pPr>
+      <w:r>
+        <w:rPr>
+          <w:rFonts w:ascii="Arial" w:hAnsi="Arial"/>
+          <w:b/>
+          <w:color w:val="000000"/>
+          <w:sz w:val="24"/>
+        </w:rPr>
+        <w:t>1. Penerapan Responsible AI dan Batasan Keamanan</w:t>
       </w:r>
     </w:p>
     <w:p>
@@ -3220,15 +938,13 @@
           <w:color w:val="000000"/>
           <w:sz w:val="21"/>
         </w:rPr>
-        <w:t>Proyek uji ini sangat menekankan pentingnya etika AI dan perlindungan privasi data. Kompetitor wajib membuktikan penerapan prinsip-prinsip kecerdasan artifisial yang bertanggung jawab melalui langkah konkret:</w:t>
+        <w:t>Peserta diwajibkan menerapkan prinsip etika kecerdasan artifisial secara nyata pada seluruh deliverables:</w:t>
         <w:br/>
-        <w:t>- Privasi (PII Redaction): Sensor wajah dan plat nomor diproses secara in-memory (RAM server) sehingga tidak ada file mentah tanpa blur yang tersimpan di cloud storage.</w:t>
+        <w:t>- Privasi (PII Redaction): Sensor wajah dan plat nomor diproses secara in-memory untuk mematuhi regulasi perlindungan data pribadi.</w:t>
         <w:br/>
-        <w:t>- Mitigasi Misinformasi (RAG Grounding): Jawaban chatbot dibatasi hanya bersumber dari database regulasi undang-undang lingkungan hidup resmi guna mencegah halusinasi LLM.</w:t>
+        <w:t>- Keandalan (Prompt Injection Guardrails): Backend mendeteksi dan menolak pola prompt injection sebelum dikirim ke mesin LLM.</w:t>
         <w:br/>
-        <w:t>- Mitigasi Keamanan (Prompt Injection Guardrails): Backend mendeteksi dan menolak pola prompt injection atau evasion sebelum input diteruskan ke model LLM.</w:t>
-        <w:br/>
-        <w:t>- Peran Penilaian Manusia (Human-in-the-Loop): AI diposisikan sebagai asisten pendukung keputusan (decision support system). Laporan dengan skor keyakinan AI di bawah 85% akan berstatus "pending_human" dan wajib divalidasi manual oleh petugas Dinas Lingkungan Hidup melalui dasbor Next.js sebelum dirilis ke publik.</w:t>
+        <w:t>- Pengawasan Manusia (Human-in-the-Loop): AI diposisikan sebagai sistem pendukung keputusan (decision support system). Laporan dengan skor keyakinan AI di bawah 85% otomatis disetel ke status "pending_human" untuk divalidasi manual oleh petugas Dinas Lingkungan Hidup melalui dasbor Next.js.</w:t>
       </w:r>
     </w:p>
     <w:p>
@@ -3244,7 +960,7 @@
           <w:color w:val="000000"/>
           <w:sz w:val="24"/>
         </w:rPr>
-        <w:t>2. Batasan Data &amp; Sumber Data</w:t>
+        <w:t>2. Batasan Data Uji</w:t>
       </w:r>
     </w:p>
     <w:p>
@@ -3260,13 +976,13 @@
           <w:color w:val="000000"/>
           <w:sz w:val="21"/>
         </w:rPr>
-        <w:t>Seluruh pengerjaan hanya diperbolehkan menggunakan data yang aman dan terbebas dari Pelanggaran Informasi Identitas Pribadi (PII):</w:t>
+        <w:t>Seluruh pengembangan proyek uji hanya menggunakan data yang aman dan bebas data PII:</w:t>
         <w:br/>
-        <w:t>1. Data Partisipasi Publik: Dataset koordinat dan foto uji coba lingkungan hasil simulasi perangkat pengembang.</w:t>
+        <w:t>- Regulasi Publik: Peraturan daerah, Peraturan Presiden, dan Undang-Undang lingkungan hidup resmi yang tersedia publik.</w:t>
         <w:br/>
-        <w:t>2. Data Regulasi Daerah: Dokumen peraturan perundang-undang resmi daerah dan nasional tentang pengelolaan lingkungan hidup.</w:t>
+        <w:t>- Dataset Terbuka: Kumpulan citra sampah publik untuk pelatihan model klasifikasi.</w:t>
         <w:br/>
-        <w:t>3. Data Historis: Data relasional PostgreSQL yang memuat profil samaran username warga dan perolehan poin gamifikasi.</w:t>
+        <w:t>- Data Sintetis: Simulasi data profil warga samaran, koordinat GPS pengembang, dan pencatatan poin gamifikasi.</w:t>
       </w:r>
     </w:p>
     <w:p>
@@ -3282,7 +998,7 @@
           <w:color w:val="000000"/>
           <w:sz w:val="24"/>
         </w:rPr>
-        <w:t>3. Rubrik Penilaian Kompetisi</w:t>
+        <w:t>3. Rubrik Penilaian Proyek Uji</w:t>
       </w:r>
     </w:p>
     <w:p>
@@ -3298,7 +1014,7 @@
           <w:color w:val="000000"/>
           <w:sz w:val="21"/>
         </w:rPr>
-        <w:t>Penilaian performa hasil kerja kompetitor oleh juri nasional didistribusikan secara transparan berdasarkan matriks penilaian pada Tabel 2.</w:t>
+        <w:t>Matriks rubrik penilaian juri nasional LKS 2026 untuk menguji performa kompetitor didistribusikan secara transparan pada Tabel 2.</w:t>
       </w:r>
     </w:p>
     <w:tbl>
@@ -3697,7 +1413,7 @@
                 <w:color w:val="000000"/>
                 <w:sz w:val="19"/>
               </w:rPr>
-              <w:t xml:space="preserve">Ketepatan </w:t>
+              <w:t xml:space="preserve">Kesesuaian </w:t>
             </w:r>
             <w:r>
               <w:rPr>
@@ -3717,47 +1433,7 @@
                 <w:color w:val="000000"/>
                 <w:sz w:val="19"/>
               </w:rPr>
-              <w:t xml:space="preserve">dalam </w:t>
-            </w:r>
-            <w:r>
-              <w:rPr>
-                <w:rFonts w:ascii="Arial" w:hAnsi="Arial"/>
-                <w:b w:val="0"/>
-                <w:i w:val="0"/>
-                <w:color w:val="000000"/>
-                <w:sz w:val="19"/>
-              </w:rPr>
-              <w:t xml:space="preserve">menyelesaikan </w:t>
-            </w:r>
-            <w:r>
-              <w:rPr>
-                <w:rFonts w:ascii="Arial" w:hAnsi="Arial"/>
-                <w:b w:val="0"/>
-                <w:i w:val="0"/>
-                <w:color w:val="000000"/>
-                <w:sz w:val="19"/>
-              </w:rPr>
-              <w:t xml:space="preserve">geospasial </w:t>
-            </w:r>
-            <w:r>
-              <w:rPr>
-                <w:rFonts w:ascii="Arial" w:hAnsi="Arial"/>
-                <w:b w:val="0"/>
-                <w:i w:val="0"/>
-                <w:color w:val="000000"/>
-                <w:sz w:val="19"/>
-              </w:rPr>
-              <w:t xml:space="preserve">spam </w:t>
-            </w:r>
-            <w:r>
-              <w:rPr>
-                <w:rFonts w:ascii="Arial" w:hAnsi="Arial"/>
-                <w:b w:val="0"/>
-                <w:i w:val="0"/>
-                <w:color w:val="000000"/>
-                <w:sz w:val="19"/>
-              </w:rPr>
-              <w:t xml:space="preserve">dan </w:t>
+              <w:t xml:space="preserve">dengan </w:t>
             </w:r>
             <w:r>
               <w:rPr>
@@ -3797,7 +1473,67 @@
                 <w:color w:val="000000"/>
                 <w:sz w:val="19"/>
               </w:rPr>
-              <w:t xml:space="preserve">lokal. </w:t>
+              <w:t xml:space="preserve">lokal, </w:t>
+            </w:r>
+            <w:r>
+              <w:rPr>
+                <w:rFonts w:ascii="Arial" w:hAnsi="Arial"/>
+                <w:b w:val="0"/>
+                <w:i w:val="0"/>
+                <w:color w:val="000000"/>
+                <w:sz w:val="19"/>
+              </w:rPr>
+              <w:t xml:space="preserve">reduksi </w:t>
+            </w:r>
+            <w:r>
+              <w:rPr>
+                <w:rFonts w:ascii="Arial" w:hAnsi="Arial"/>
+                <w:b w:val="0"/>
+                <w:i w:val="0"/>
+                <w:color w:val="000000"/>
+                <w:sz w:val="19"/>
+              </w:rPr>
+              <w:t xml:space="preserve">spam </w:t>
+            </w:r>
+            <w:r>
+              <w:rPr>
+                <w:rFonts w:ascii="Arial" w:hAnsi="Arial"/>
+                <w:b w:val="0"/>
+                <w:i w:val="0"/>
+                <w:color w:val="000000"/>
+                <w:sz w:val="19"/>
+              </w:rPr>
+              <w:t xml:space="preserve">spasial, </w:t>
+            </w:r>
+            <w:r>
+              <w:rPr>
+                <w:rFonts w:ascii="Arial" w:hAnsi="Arial"/>
+                <w:b w:val="0"/>
+                <w:i w:val="0"/>
+                <w:color w:val="000000"/>
+                <w:sz w:val="19"/>
+              </w:rPr>
+              <w:t xml:space="preserve">dan </w:t>
+            </w:r>
+            <w:r>
+              <w:rPr>
+                <w:rFonts w:ascii="Arial" w:hAnsi="Arial"/>
+                <w:b w:val="0"/>
+                <w:i w:val="0"/>
+                <w:color w:val="000000"/>
+                <w:sz w:val="19"/>
+              </w:rPr>
+              <w:t xml:space="preserve">retensi </w:t>
+            </w:r>
+            <w:r>
+              <w:rPr>
+                <w:rFonts w:ascii="Arial" w:hAnsi="Arial"/>
+                <w:b w:val="0"/>
+                <w:i w:val="0"/>
+                <w:color w:val="000000"/>
+                <w:sz w:val="19"/>
+              </w:rPr>
+              <w:t xml:space="preserve">pengguna. </w:t>
             </w:r>
           </w:p>
         </w:tc>
@@ -3989,7 +1725,7 @@
                 <w:color w:val="000000"/>
                 <w:sz w:val="19"/>
               </w:rPr>
-              <w:t xml:space="preserve">gamifikasi, </w:t>
+              <w:t xml:space="preserve">gamifikasi </w:t>
             </w:r>
             <w:r>
               <w:rPr>
@@ -3999,7 +1735,17 @@
                 <w:color w:val="000000"/>
                 <w:sz w:val="19"/>
               </w:rPr>
-              <w:t xml:space="preserve">deteksi </w:t>
+              <w:t xml:space="preserve">warga, </w:t>
+            </w:r>
+            <w:r>
+              <w:rPr>
+                <w:rFonts w:ascii="Arial" w:hAnsi="Arial"/>
+                <w:b w:val="0"/>
+                <w:i w:val="0"/>
+                <w:color w:val="000000"/>
+                <w:sz w:val="19"/>
+              </w:rPr>
+              <w:t xml:space="preserve">deduplikasi </w:t>
             </w:r>
             <w:r>
               <w:rPr>
@@ -4039,17 +1785,27 @@
                 <w:color w:val="000000"/>
                 <w:sz w:val="19"/>
               </w:rPr>
+              <w:t xml:space="preserve">perutean </w:t>
+            </w:r>
+            <w:r>
+              <w:rPr>
+                <w:rFonts w:ascii="Arial" w:hAnsi="Arial"/>
+                <w:b w:val="0"/>
+                <w:i w:val="0"/>
+                <w:color w:val="000000"/>
+                <w:sz w:val="19"/>
+              </w:rPr>
               <w:t xml:space="preserve">model </w:t>
             </w:r>
             <w:r>
               <w:rPr>
                 <w:rFonts w:ascii="Arial" w:hAnsi="Arial"/>
                 <w:b w:val="0"/>
-                <w:i/>
+                <w:i w:val="0"/>
                 <w:color w:val="000000"/>
                 <w:sz w:val="19"/>
               </w:rPr>
-              <w:t xml:space="preserve">routing </w:t>
+              <w:t xml:space="preserve">AI </w:t>
             </w:r>
             <w:r>
               <w:rPr>
@@ -4251,7 +2007,47 @@
                 <w:color w:val="000000"/>
                 <w:sz w:val="19"/>
               </w:rPr>
-              <w:t xml:space="preserve">Keberhasilan </w:t>
+              <w:t xml:space="preserve">Akurasi </w:t>
+            </w:r>
+            <w:r>
+              <w:rPr>
+                <w:rFonts w:ascii="Arial" w:hAnsi="Arial"/>
+                <w:b w:val="0"/>
+                <w:i w:val="0"/>
+                <w:color w:val="000000"/>
+                <w:sz w:val="19"/>
+              </w:rPr>
+              <w:t xml:space="preserve">model </w:t>
+            </w:r>
+            <w:r>
+              <w:rPr>
+                <w:rFonts w:ascii="Arial" w:hAnsi="Arial"/>
+                <w:b w:val="0"/>
+                <w:i w:val="0"/>
+                <w:color w:val="000000"/>
+                <w:sz w:val="19"/>
+              </w:rPr>
+              <w:t xml:space="preserve">visi </w:t>
+            </w:r>
+            <w:r>
+              <w:rPr>
+                <w:rFonts w:ascii="Arial" w:hAnsi="Arial"/>
+                <w:b w:val="0"/>
+                <w:i w:val="0"/>
+                <w:color w:val="000000"/>
+                <w:sz w:val="19"/>
+              </w:rPr>
+              <w:t xml:space="preserve">AI </w:t>
+            </w:r>
+            <w:r>
+              <w:rPr>
+                <w:rFonts w:ascii="Arial" w:hAnsi="Arial"/>
+                <w:b w:val="0"/>
+                <w:i w:val="0"/>
+                <w:color w:val="000000"/>
+                <w:sz w:val="19"/>
+              </w:rPr>
+              <w:t xml:space="preserve">dalam </w:t>
             </w:r>
             <w:r>
               <w:rPr>
@@ -4271,37 +2067,7 @@
                 <w:color w:val="000000"/>
                 <w:sz w:val="19"/>
               </w:rPr>
-              <w:t xml:space="preserve">citra </w:t>
-            </w:r>
-            <w:r>
-              <w:rPr>
-                <w:rFonts w:ascii="Arial" w:hAnsi="Arial"/>
-                <w:b w:val="0"/>
-                <w:i w:val="0"/>
-                <w:color w:val="000000"/>
-                <w:sz w:val="19"/>
-              </w:rPr>
-              <w:t xml:space="preserve">Gemini </w:t>
-            </w:r>
-            <w:r>
-              <w:rPr>
-                <w:rFonts w:ascii="Arial" w:hAnsi="Arial"/>
-                <w:b w:val="0"/>
-                <w:i w:val="0"/>
-                <w:color w:val="000000"/>
-                <w:sz w:val="19"/>
-              </w:rPr>
-              <w:t xml:space="preserve">3.5 </w:t>
-            </w:r>
-            <w:r>
-              <w:rPr>
-                <w:rFonts w:ascii="Arial" w:hAnsi="Arial"/>
-                <w:b w:val="0"/>
-                <w:i/>
-                <w:color w:val="000000"/>
-                <w:sz w:val="19"/>
-              </w:rPr>
-              <w:t xml:space="preserve">Flash </w:t>
+              <w:t xml:space="preserve">sampah </w:t>
             </w:r>
             <w:r>
               <w:rPr>
@@ -4331,7 +2097,7 @@
                 <w:color w:val="000000"/>
                 <w:sz w:val="19"/>
               </w:rPr>
-              <w:t xml:space="preserve">pencarian </w:t>
+              <w:t xml:space="preserve">chatbot </w:t>
             </w:r>
             <w:r>
               <w:rPr>
@@ -4341,7 +2107,7 @@
                 <w:color w:val="000000"/>
                 <w:sz w:val="19"/>
               </w:rPr>
-              <w:t xml:space="preserve">dokumen </w:t>
+              <w:t xml:space="preserve">RAG </w:t>
             </w:r>
             <w:r>
               <w:rPr>
@@ -4351,7 +2117,7 @@
                 <w:color w:val="000000"/>
                 <w:sz w:val="19"/>
               </w:rPr>
-              <w:t xml:space="preserve">RAG. </w:t>
+              <w:t xml:space="preserve">regulasi. </w:t>
             </w:r>
           </w:p>
         </w:tc>
@@ -4473,7 +2239,7 @@
                 <w:color w:val="000000"/>
                 <w:sz w:val="19"/>
               </w:rPr>
-              <w:t xml:space="preserve">PII) </w:t>
+              <w:t xml:space="preserve">Privasi) </w:t>
             </w:r>
           </w:p>
         </w:tc>
@@ -4543,7 +2309,7 @@
                 <w:color w:val="000000"/>
                 <w:sz w:val="19"/>
               </w:rPr>
-              <w:t xml:space="preserve">Keandalan </w:t>
+              <w:t xml:space="preserve">Keamanan </w:t>
             </w:r>
             <w:r>
               <w:rPr>
@@ -4553,7 +2319,7 @@
                 <w:color w:val="000000"/>
                 <w:sz w:val="19"/>
               </w:rPr>
-              <w:t xml:space="preserve">modul </w:t>
+              <w:t xml:space="preserve">pemrosesan </w:t>
             </w:r>
             <w:r>
               <w:rPr>
@@ -4569,11 +2335,21 @@
               <w:rPr>
                 <w:rFonts w:ascii="Arial" w:hAnsi="Arial"/>
                 <w:b w:val="0"/>
+                <w:i w:val="0"/>
+                <w:color w:val="000000"/>
+                <w:sz w:val="19"/>
+              </w:rPr>
+              <w:t xml:space="preserve">gambar </w:t>
+            </w:r>
+            <w:r>
+              <w:rPr>
+                <w:rFonts w:ascii="Arial" w:hAnsi="Arial"/>
+                <w:b w:val="0"/>
                 <w:i/>
                 <w:color w:val="000000"/>
                 <w:sz w:val="19"/>
               </w:rPr>
-              <w:t xml:space="preserve">Sharp </w:t>
+              <w:t xml:space="preserve">in-memory </w:t>
             </w:r>
             <w:r>
               <w:rPr>
@@ -4593,7 +2369,7 @@
                 <w:color w:val="000000"/>
                 <w:sz w:val="19"/>
               </w:rPr>
-              <w:t xml:space="preserve">validasi </w:t>
+              <w:t xml:space="preserve">keandalan </w:t>
             </w:r>
             <w:r>
               <w:rPr>
@@ -4603,7 +2379,7 @@
                 <w:color w:val="000000"/>
                 <w:sz w:val="19"/>
               </w:rPr>
-              <w:t xml:space="preserve">manual </w:t>
+              <w:t xml:space="preserve">batas </w:t>
             </w:r>
             <w:r>
               <w:rPr>
@@ -4623,27 +2399,7 @@
                 <w:color w:val="000000"/>
                 <w:sz w:val="19"/>
               </w:rPr>
-              <w:t xml:space="preserve">pending_human </w:t>
-            </w:r>
-            <w:r>
-              <w:rPr>
-                <w:rFonts w:ascii="Arial" w:hAnsi="Arial"/>
-                <w:b w:val="0"/>
-                <w:i w:val="0"/>
-                <w:color w:val="000000"/>
-                <w:sz w:val="19"/>
-              </w:rPr>
-              <w:t xml:space="preserve">di </w:t>
-            </w:r>
-            <w:r>
-              <w:rPr>
-                <w:rFonts w:ascii="Arial" w:hAnsi="Arial"/>
-                <w:b w:val="0"/>
-                <w:i w:val="0"/>
-                <w:color w:val="000000"/>
-                <w:sz w:val="19"/>
-              </w:rPr>
-              <w:t xml:space="preserve">dasbor. </w:t>
+              <w:t xml:space="preserve">pending_human. </w:t>
             </w:r>
           </w:p>
         </w:tc>
@@ -4795,7 +2551,7 @@
                 <w:color w:val="000000"/>
                 <w:sz w:val="19"/>
               </w:rPr>
-              <w:t xml:space="preserve">Kemudahan </w:t>
+              <w:t xml:space="preserve">Kestabilan </w:t>
             </w:r>
             <w:r>
               <w:rPr>
@@ -4821,16 +2577,6 @@
               <w:rPr>
                 <w:rFonts w:ascii="Arial" w:hAnsi="Arial"/>
                 <w:b w:val="0"/>
-                <w:i w:val="0"/>
-                <w:color w:val="000000"/>
-                <w:sz w:val="19"/>
-              </w:rPr>
-              <w:t xml:space="preserve">mobile </w:t>
-            </w:r>
-            <w:r>
-              <w:rPr>
-                <w:rFonts w:ascii="Arial" w:hAnsi="Arial"/>
-                <w:b w:val="0"/>
                 <w:i/>
                 <w:color w:val="000000"/>
                 <w:sz w:val="19"/>
@@ -4845,7 +2591,7 @@
                 <w:color w:val="000000"/>
                 <w:sz w:val="19"/>
               </w:rPr>
-              <w:t xml:space="preserve">kestabilan </w:t>
+              <w:t xml:space="preserve">NestJS </w:t>
             </w:r>
             <w:r>
               <w:rPr>
@@ -4885,7 +2631,7 @@
                 <w:color w:val="000000"/>
                 <w:sz w:val="19"/>
               </w:rPr>
-              <w:t xml:space="preserve">integrasi </w:t>
+              <w:t xml:space="preserve">visualisasi </w:t>
             </w:r>
             <w:r>
               <w:rPr>
@@ -5087,7 +2833,7 @@
                 <w:color w:val="000000"/>
                 <w:sz w:val="19"/>
               </w:rPr>
-              <w:t xml:space="preserve">struktur </w:t>
+              <w:t xml:space="preserve">penulisan </w:t>
             </w:r>
             <w:r>
               <w:rPr>
@@ -5137,7 +2883,17 @@
                 <w:color w:val="000000"/>
                 <w:sz w:val="19"/>
               </w:rPr>
-              <w:t xml:space="preserve">teknis, </w:t>
+              <w:t xml:space="preserve">teknis </w:t>
+            </w:r>
+            <w:r>
+              <w:rPr>
+                <w:rFonts w:ascii="Arial" w:hAnsi="Arial"/>
+                <w:b w:val="0"/>
+                <w:i w:val="0"/>
+                <w:color w:val="000000"/>
+                <w:sz w:val="19"/>
+              </w:rPr>
+              <w:t xml:space="preserve">proposal, </w:t>
             </w:r>
             <w:r>
               <w:rPr>
@@ -5157,16 +2913,6 @@
                 <w:color w:val="000000"/>
                 <w:sz w:val="19"/>
               </w:rPr>
-              <w:t xml:space="preserve">kejelasan </w:t>
-            </w:r>
-            <w:r>
-              <w:rPr>
-                <w:rFonts w:ascii="Arial" w:hAnsi="Arial"/>
-                <w:b w:val="0"/>
-                <w:i w:val="0"/>
-                <w:color w:val="000000"/>
-                <w:sz w:val="19"/>
-              </w:rPr>
               <w:t xml:space="preserve">video </w:t>
             </w:r>
             <w:r>
@@ -5177,7 +2923,7 @@
                 <w:color w:val="000000"/>
                 <w:sz w:val="19"/>
               </w:rPr>
-              <w:t xml:space="preserve">presentasi. </w:t>
+              <w:t xml:space="preserve">demo. </w:t>
             </w:r>
           </w:p>
         </w:tc>
@@ -5195,7 +2941,7 @@
           <w:color w:val="555555"/>
           <w:sz w:val="18"/>
         </w:rPr>
-        <w:t>Tabel 2. Rubrik penilaian penentuan pemenang kompetisi AI LKS Nasional 2026.</w:t>
+        <w:t>Tabel 2. Matriks kriteria penilaian juri ekshibisi AI LKS Nasional 2026.</w:t>
       </w:r>
     </w:p>
     <w:sectPr>
@@ -5224,7 +2970,7 @@
         <w:color w:val="555555"/>
         <w:sz w:val="17"/>
       </w:rPr>
-      <w:t>Date: 05.07.2026  |  Version: 1.0  |  LKS2026_TP_AI_EN  |  © WorldSkills International</w:t>
+      <w:t>Tanggal: 05.07.2026  |  Versi: 1.0  |  LKS2026_TP_AI_ID  |  © WorldSkills International</w:t>
     </w:r>
   </w:p>
 </w:ftr>

</xml_diff>